<commit_message>
E3: regenerar docx guion pitch con lenguaje inclusivo en bloque 1
Co-Authored-By: Claude Sonnet 4.6 <noreply@anthropic.com>
</commit_message>
<xml_diff>
--- a/business/CareSignal_Pitch_Guion_4min.docx
+++ b/business/CareSignal_Pitch_Guion_4min.docx
@@ -1355,20 +1355,20 @@
           <w:sz w:val="24"/>
           <w:szCs w:val="24"/>
         </w:rPr>
-        <w:t xml:space="preserve">Cuando llevas a tu mamá a una residencia, le estás confiando lo más valioso</w:t>
-      </w:r>
-      <w:r>
-        <w:br/>
-        <w:t xml:space="preserve"/>
-      </w:r>
-      <w:r>
-        <w:rPr>
-          <w:rFonts w:ascii="Calibri" w:cs="Calibri" w:eastAsia="Calibri" w:hAnsi="Calibri"/>
-          <w:color w:val="000000"/>
-          <w:sz w:val="24"/>
-          <w:szCs w:val="24"/>
-        </w:rPr>
-        <w:t xml:space="preserve">que tienes — su tiempo, su dignidad, su seguridad.</w:t>
+        <w:t xml:space="preserve">Cuando llevas a ese familiar, a ese ser querido, a una residencia,</w:t>
+      </w:r>
+      <w:r>
+        <w:br/>
+        <w:t xml:space="preserve"/>
+      </w:r>
+      <w:r>
+        <w:rPr>
+          <w:rFonts w:ascii="Calibri" w:cs="Calibri" w:eastAsia="Calibri" w:hAnsi="Calibri"/>
+          <w:color w:val="000000"/>
+          <w:sz w:val="24"/>
+          <w:szCs w:val="24"/>
+        </w:rPr>
+        <w:t xml:space="preserve">le estás confiando lo más valioso que tienes — su tiempo, su dignidad, su seguridad.</w:t>
       </w:r>
       <w:r>
         <w:br/>

</xml_diff>

<commit_message>
E3: guion pitch — refinamiento del remate del bloque 1
Reemplaza "No sabemos cuántas fueron evitables" por framing de
acompañamiento digno: más emocional, más conectado con el problema
de cuidados que CareSignal resuelve. También aplica cambio previo
de la pregunta retórica (registro en cuaderno / WhatsApp).

Co-Authored-By: Claude Sonnet 4.6 <noreply@anthropic.com>
</commit_message>
<xml_diff>
--- a/business/CareSignal_Pitch_Guion_4min.docx
+++ b/business/CareSignal_Pitch_Guion_4min.docx
@@ -1406,20 +1406,33 @@
           <w:sz w:val="24"/>
           <w:szCs w:val="24"/>
         </w:rPr>
-        <w:t xml:space="preserve">¿Cuándo el único registro es un cuaderno que puede perderse,</w:t>
-      </w:r>
-      <w:r>
-        <w:br/>
-        <w:t xml:space="preserve"/>
-      </w:r>
-      <w:r>
-        <w:rPr>
-          <w:rFonts w:ascii="Calibri" w:cs="Calibri" w:eastAsia="Calibri" w:hAnsi="Calibri"/>
-          <w:color w:val="000000"/>
-          <w:sz w:val="24"/>
-          <w:szCs w:val="24"/>
-        </w:rPr>
-        <w:t xml:space="preserve">o un grupo de WhatsApp que nadie revisa?</w:t>
+        <w:t xml:space="preserve">¿Cuándo el único registro de atención y de los cuidados que deben realizarse</w:t>
+      </w:r>
+      <w:r>
+        <w:br/>
+        <w:t xml:space="preserve"/>
+      </w:r>
+      <w:r>
+        <w:rPr>
+          <w:rFonts w:ascii="Calibri" w:cs="Calibri" w:eastAsia="Calibri" w:hAnsi="Calibri"/>
+          <w:color w:val="000000"/>
+          <w:sz w:val="24"/>
+          <w:szCs w:val="24"/>
+        </w:rPr>
+        <w:t xml:space="preserve">se registran en un cuaderno que puede perderse, o un grupo de WhatsApp</w:t>
+      </w:r>
+      <w:r>
+        <w:br/>
+        <w:t xml:space="preserve"/>
+      </w:r>
+      <w:r>
+        <w:rPr>
+          <w:rFonts w:ascii="Calibri" w:cs="Calibri" w:eastAsia="Calibri" w:hAnsi="Calibri"/>
+          <w:color w:val="000000"/>
+          <w:sz w:val="24"/>
+          <w:szCs w:val="24"/>
+        </w:rPr>
+        <w:t xml:space="preserve">que nadie revisa e incluso en ocasiones ni se registra?</w:t>
       </w:r>
       <w:r>
         <w:br/>
@@ -1482,20 +1495,33 @@
           <w:sz w:val="24"/>
           <w:szCs w:val="24"/>
         </w:rPr>
-        <w:t xml:space="preserve">No sabemos cuántas de esas muertes fueron evitables.</w:t>
-      </w:r>
-      <w:r>
-        <w:br/>
-        <w:t xml:space="preserve"/>
-      </w:r>
-      <w:r>
-        <w:rPr>
-          <w:rFonts w:ascii="Calibri" w:cs="Calibri" w:eastAsia="Calibri" w:hAnsi="Calibri"/>
-          <w:color w:val="000000"/>
-          <w:sz w:val="24"/>
-          <w:szCs w:val="24"/>
-        </w:rPr>
-        <w:t xml:space="preserve">Y eso — esa incertidumbre — es exactamente el problema que estamos resolviendo."</w:t>
+        <w:t xml:space="preserve">Se estima que estos fallecimientos no sucedieron con un acompañamiento digno</w:t>
+      </w:r>
+      <w:r>
+        <w:br/>
+        <w:t xml:space="preserve"/>
+      </w:r>
+      <w:r>
+        <w:rPr>
+          <w:rFonts w:ascii="Calibri" w:cs="Calibri" w:eastAsia="Calibri" w:hAnsi="Calibri"/>
+          <w:color w:val="000000"/>
+          <w:sz w:val="24"/>
+          <w:szCs w:val="24"/>
+        </w:rPr>
+        <w:t xml:space="preserve">y tareas de cuidado al ser querido hasta el final.</w:t>
+      </w:r>
+      <w:r>
+        <w:br/>
+        <w:t xml:space="preserve"/>
+      </w:r>
+      <w:r>
+        <w:rPr>
+          <w:rFonts w:ascii="Calibri" w:cs="Calibri" w:eastAsia="Calibri" w:hAnsi="Calibri"/>
+          <w:color w:val="000000"/>
+          <w:sz w:val="24"/>
+          <w:szCs w:val="24"/>
+        </w:rPr>
+        <w:t xml:space="preserve">Y esa incertidumbre es exactamente el problema que estamos resolviendo."</w:t>
       </w:r>
     </w:p>
     <w:p>

</xml_diff>

<commit_message>
E3: guion pitch — bloque 1 con cadena causal y datos CNDH precisos
- Pregunta retórica: "ningún cuidador sabe si la ronda ocurrió"
- Dato CNDH corregido: 58 de 1,500 residencias inspeccionadas
- Remate causal: sin registro → sin responsabilidad → sin cuidado digno

Co-Authored-By: Claude Sonnet 4.6 <noreply@anthropic.com>
</commit_message>
<xml_diff>
--- a/business/CareSignal_Pitch_Guion_4min.docx
+++ b/business/CareSignal_Pitch_Guion_4min.docx
@@ -1393,46 +1393,46 @@
           <w:sz w:val="24"/>
           <w:szCs w:val="24"/>
         </w:rPr>
-        <w:t xml:space="preserve">¿Qué pasa cuando nadie sabe si alguien fue a verla a las 3 de la mañana?</w:t>
-      </w:r>
-      <w:r>
-        <w:br/>
-        <w:t xml:space="preserve"/>
-      </w:r>
-      <w:r>
-        <w:rPr>
-          <w:rFonts w:ascii="Calibri" w:cs="Calibri" w:eastAsia="Calibri" w:hAnsi="Calibri"/>
-          <w:color w:val="000000"/>
-          <w:sz w:val="24"/>
-          <w:szCs w:val="24"/>
-        </w:rPr>
-        <w:t xml:space="preserve">¿Cuándo el único registro de atención y de los cuidados que deben realizarse</w:t>
-      </w:r>
-      <w:r>
-        <w:br/>
-        <w:t xml:space="preserve"/>
-      </w:r>
-      <w:r>
-        <w:rPr>
-          <w:rFonts w:ascii="Calibri" w:cs="Calibri" w:eastAsia="Calibri" w:hAnsi="Calibri"/>
-          <w:color w:val="000000"/>
-          <w:sz w:val="24"/>
-          <w:szCs w:val="24"/>
-        </w:rPr>
-        <w:t xml:space="preserve">se registran en un cuaderno que puede perderse, o un grupo de WhatsApp</w:t>
-      </w:r>
-      <w:r>
-        <w:br/>
-        <w:t xml:space="preserve"/>
-      </w:r>
-      <w:r>
-        <w:rPr>
-          <w:rFonts w:ascii="Calibri" w:cs="Calibri" w:eastAsia="Calibri" w:hAnsi="Calibri"/>
-          <w:color w:val="000000"/>
-          <w:sz w:val="24"/>
-          <w:szCs w:val="24"/>
-        </w:rPr>
-        <w:t xml:space="preserve">que nadie revisa e incluso en ocasiones ni se registra?</w:t>
+        <w:t xml:space="preserve">¿Qué pasa cuando ningún cuidador de la residencia sabe si alguien fue a verla</w:t>
+      </w:r>
+      <w:r>
+        <w:br/>
+        <w:t xml:space="preserve"/>
+      </w:r>
+      <w:r>
+        <w:rPr>
+          <w:rFonts w:ascii="Calibri" w:cs="Calibri" w:eastAsia="Calibri" w:hAnsi="Calibri"/>
+          <w:color w:val="000000"/>
+          <w:sz w:val="24"/>
+          <w:szCs w:val="24"/>
+        </w:rPr>
+        <w:t xml:space="preserve">a las 3 de la mañana — o si la ronda de cuidado simplemente no ocurrió?</w:t>
+      </w:r>
+      <w:r>
+        <w:br/>
+        <w:t xml:space="preserve"/>
+      </w:r>
+      <w:r>
+        <w:rPr>
+          <w:rFonts w:ascii="Calibri" w:cs="Calibri" w:eastAsia="Calibri" w:hAnsi="Calibri"/>
+          <w:color w:val="000000"/>
+          <w:sz w:val="24"/>
+          <w:szCs w:val="24"/>
+        </w:rPr>
+        <w:t xml:space="preserve">¿Cuándo el único registro de atención es un cuaderno que puede perderse,</w:t>
+      </w:r>
+      <w:r>
+        <w:br/>
+        <w:t xml:space="preserve"/>
+      </w:r>
+      <w:r>
+        <w:rPr>
+          <w:rFonts w:ascii="Calibri" w:cs="Calibri" w:eastAsia="Calibri" w:hAnsi="Calibri"/>
+          <w:color w:val="000000"/>
+          <w:sz w:val="24"/>
+          <w:szCs w:val="24"/>
+        </w:rPr>
+        <w:t xml:space="preserve">un grupo de WhatsApp que nadie revisa, o simplemente no existe?"</w:t>
       </w:r>
       <w:r>
         <w:br/>
@@ -1470,7 +1470,46 @@
           <w:sz w:val="24"/>
           <w:szCs w:val="24"/>
         </w:rPr>
-        <w:t xml:space="preserve">Muchas en residencias. La CNDH documentó que menos del 4% fueron supervisadas.</w:t>
+        <w:t xml:space="preserve">Muchas de ellas en residencias de cuidado.</w:t>
+      </w:r>
+      <w:r>
+        <w:br/>
+        <w:t xml:space="preserve"/>
+      </w:r>
+      <w:r>
+        <w:rPr>
+          <w:rFonts w:ascii="Calibri" w:cs="Calibri" w:eastAsia="Calibri" w:hAnsi="Calibri"/>
+          <w:color w:val="000000"/>
+          <w:sz w:val="24"/>
+          <w:szCs w:val="24"/>
+        </w:rPr>
+        <w:t xml:space="preserve">La CNDH solo pudo inspeccionar 58 de más de 1,500 residencias en todo el país.</w:t>
+      </w:r>
+      <w:r>
+        <w:br/>
+        <w:t xml:space="preserve"/>
+      </w:r>
+      <w:r>
+        <w:rPr>
+          <w:rFonts w:ascii="Calibri" w:cs="Calibri" w:eastAsia="Calibri" w:hAnsi="Calibri"/>
+          <w:color w:val="000000"/>
+          <w:sz w:val="24"/>
+          <w:szCs w:val="24"/>
+        </w:rPr>
+        <w:t xml:space="preserve">Y en las que logró visitar documentó condiciones de abandono,</w:t>
+      </w:r>
+      <w:r>
+        <w:br/>
+        <w:t xml:space="preserve"/>
+      </w:r>
+      <w:r>
+        <w:rPr>
+          <w:rFonts w:ascii="Calibri" w:cs="Calibri" w:eastAsia="Calibri" w:hAnsi="Calibri"/>
+          <w:color w:val="000000"/>
+          <w:sz w:val="24"/>
+          <w:szCs w:val="24"/>
+        </w:rPr>
+        <w:t xml:space="preserve">falta de personal y deficiencias operativas.</w:t>
       </w:r>
       <w:r>
         <w:br/>
@@ -1495,33 +1534,59 @@
           <w:sz w:val="24"/>
           <w:szCs w:val="24"/>
         </w:rPr>
-        <w:t xml:space="preserve">Se estima que estos fallecimientos no sucedieron con un acompañamiento digno</w:t>
-      </w:r>
-      <w:r>
-        <w:br/>
-        <w:t xml:space="preserve"/>
-      </w:r>
-      <w:r>
-        <w:rPr>
-          <w:rFonts w:ascii="Calibri" w:cs="Calibri" w:eastAsia="Calibri" w:hAnsi="Calibri"/>
-          <w:color w:val="000000"/>
-          <w:sz w:val="24"/>
-          <w:szCs w:val="24"/>
-        </w:rPr>
-        <w:t xml:space="preserve">y tareas de cuidado al ser querido hasta el final.</w:t>
-      </w:r>
-      <w:r>
-        <w:br/>
-        <w:t xml:space="preserve"/>
-      </w:r>
-      <w:r>
-        <w:rPr>
-          <w:rFonts w:ascii="Calibri" w:cs="Calibri" w:eastAsia="Calibri" w:hAnsi="Calibri"/>
-          <w:color w:val="000000"/>
-          <w:sz w:val="24"/>
-          <w:szCs w:val="24"/>
-        </w:rPr>
-        <w:t xml:space="preserve">Y esa incertidumbre es exactamente el problema que estamos resolviendo."</w:t>
+        <w:t xml:space="preserve">Cuando no hay registro, no hay responsabilidad.</w:t>
+      </w:r>
+      <w:r>
+        <w:br/>
+        <w:t xml:space="preserve"/>
+      </w:r>
+      <w:r>
+        <w:rPr>
+          <w:rFonts w:ascii="Calibri" w:cs="Calibri" w:eastAsia="Calibri" w:hAnsi="Calibri"/>
+          <w:color w:val="000000"/>
+          <w:sz w:val="24"/>
+          <w:szCs w:val="24"/>
+        </w:rPr>
+        <w:t xml:space="preserve">Cuando no hay responsabilidad, no hay cuidado digno.</w:t>
+      </w:r>
+      <w:r>
+        <w:br/>
+        <w:t xml:space="preserve"/>
+      </w:r>
+      <w:r>
+        <w:rPr>
+          <w:rFonts w:ascii="Calibri" w:cs="Calibri" w:eastAsia="Calibri" w:hAnsi="Calibri"/>
+          <w:color w:val="000000"/>
+          <w:sz w:val="24"/>
+          <w:szCs w:val="24"/>
+        </w:rPr>
+        <w:t xml:space="preserve">Y cuando no hay cuidado digno — ese familiar no tiene el acompañamiento</w:t>
+      </w:r>
+      <w:r>
+        <w:br/>
+        <w:t xml:space="preserve"/>
+      </w:r>
+      <w:r>
+        <w:rPr>
+          <w:rFonts w:ascii="Calibri" w:cs="Calibri" w:eastAsia="Calibri" w:hAnsi="Calibri"/>
+          <w:color w:val="000000"/>
+          <w:sz w:val="24"/>
+          <w:szCs w:val="24"/>
+        </w:rPr>
+        <w:t xml:space="preserve">que merece hasta el final.</w:t>
+      </w:r>
+      <w:r>
+        <w:br/>
+        <w:t xml:space="preserve"/>
+      </w:r>
+      <w:r>
+        <w:rPr>
+          <w:rFonts w:ascii="Calibri" w:cs="Calibri" w:eastAsia="Calibri" w:hAnsi="Calibri"/>
+          <w:color w:val="000000"/>
+          <w:sz w:val="24"/>
+          <w:szCs w:val="24"/>
+        </w:rPr>
+        <w:t xml:space="preserve">Eso es exactamente el problema que estamos resolviendo."</w:t>
       </w:r>
     </w:p>
     <w:p>

</xml_diff>

<commit_message>
E3: guion pitch — dato LatAm integrado en bloque 1
Agrega cifras CEPAL verificadas: 65M personas 65+ en LatAm hoy,
138M proyectadas para 2050 (casi 1 de cada 5 latinoamericanos).
Fuentes: CEPAL/ONU 2024 · CEPAL/OPS 2050 — en docs/09-datos-mercado.md.

Co-Authored-By: Claude Sonnet 4.6 <noreply@anthropic.com>
</commit_message>
<xml_diff>
--- a/business/CareSignal_Pitch_Guion_4min.docx
+++ b/business/CareSignal_Pitch_Guion_4min.docx
@@ -1317,20 +1317,46 @@
           <w:sz w:val="24"/>
           <w:szCs w:val="24"/>
         </w:rPr>
-        <w:t xml:space="preserve">Y llega un momento en que las personas que más queremos ya no pueden</w:t>
-      </w:r>
-      <w:r>
-        <w:br/>
-        <w:t xml:space="preserve"/>
-      </w:r>
-      <w:r>
-        <w:rPr>
-          <w:rFonts w:ascii="Calibri" w:cs="Calibri" w:eastAsia="Calibri" w:hAnsi="Calibri"/>
-          <w:color w:val="000000"/>
-          <w:sz w:val="24"/>
-          <w:szCs w:val="24"/>
-        </w:rPr>
-        <w:t xml:space="preserve">cuidarse solas. En México, ese momento ya llegó para 17 millones de familias.</w:t>
+        <w:t xml:space="preserve">Y llega un momento en que las personas que más queremos ya no pueden cuidarse solas.</w:t>
+      </w:r>
+      <w:r>
+        <w:br/>
+        <w:t xml:space="preserve"/>
+      </w:r>
+      <w:r>
+        <w:rPr>
+          <w:rFonts w:ascii="Calibri" w:cs="Calibri" w:eastAsia="Calibri" w:hAnsi="Calibri"/>
+          <w:color w:val="000000"/>
+          <w:sz w:val="24"/>
+          <w:szCs w:val="24"/>
+        </w:rPr>
+        <w:t xml:space="preserve">En México, ese momento ya llegó para 17 millones de personas mayores.</w:t>
+      </w:r>
+      <w:r>
+        <w:br/>
+        <w:t xml:space="preserve"/>
+      </w:r>
+      <w:r>
+        <w:rPr>
+          <w:rFonts w:ascii="Calibri" w:cs="Calibri" w:eastAsia="Calibri" w:hAnsi="Calibri"/>
+          <w:color w:val="000000"/>
+          <w:sz w:val="24"/>
+          <w:szCs w:val="24"/>
+        </w:rPr>
+        <w:t xml:space="preserve">En América Latina, para más de 65 millones.</w:t>
+      </w:r>
+      <w:r>
+        <w:br/>
+        <w:t xml:space="preserve"/>
+      </w:r>
+      <w:r>
+        <w:rPr>
+          <w:rFonts w:ascii="Calibri" w:cs="Calibri" w:eastAsia="Calibri" w:hAnsi="Calibri"/>
+          <w:color w:val="000000"/>
+          <w:sz w:val="24"/>
+          <w:szCs w:val="24"/>
+        </w:rPr>
+        <w:t xml:space="preserve">Y según la CEPAL, para 2050 serán 138 millones — casi 1 de cada 5 latinoamericanos.</w:t>
       </w:r>
       <w:r>
         <w:br/>

</xml_diff>

<commit_message>
E3: bloque 1 — derecho a cuidado digno como remate de la cadena causal
Agrega marco de derechos ONU/ley mexicana: "sin rendición de cuentas,
un derecho reconocido por la ONU y la ley mexicana se vuelve invisible
e inauditable." Conecta deficiencias CNDH → necesidad de CareSignal.

Co-Authored-By: Claude Sonnet 4.6 <noreply@anthropic.com>
</commit_message>
<xml_diff>
--- a/business/CareSignal_Pitch_Guion_4min.docx
+++ b/business/CareSignal_Pitch_Guion_4min.docx
@@ -1523,6 +1523,71 @@
           <w:szCs w:val="24"/>
         </w:rPr>
         <w:t xml:space="preserve">que el cuidado ocurrió, en el momento correcto, con la persona correcta.</w:t>
+      </w:r>
+      <w:r>
+        <w:br/>
+        <w:t xml:space="preserve"/>
+      </w:r>
+      <w:r>
+        <w:rPr>
+          <w:rFonts w:ascii="Calibri" w:cs="Calibri" w:eastAsia="Calibri" w:hAnsi="Calibri"/>
+          <w:color w:val="000000"/>
+          <w:sz w:val="24"/>
+          <w:szCs w:val="24"/>
+        </w:rPr>
+        <w:t xml:space="preserve">Sin registro, no hay trazabilidad.</w:t>
+      </w:r>
+      <w:r>
+        <w:br/>
+        <w:t xml:space="preserve"/>
+      </w:r>
+      <w:r>
+        <w:rPr>
+          <w:rFonts w:ascii="Calibri" w:cs="Calibri" w:eastAsia="Calibri" w:hAnsi="Calibri"/>
+          <w:color w:val="000000"/>
+          <w:sz w:val="24"/>
+          <w:szCs w:val="24"/>
+        </w:rPr>
+        <w:t xml:space="preserve">Sin trazabilidad, no hay rendición de cuentas.</w:t>
+      </w:r>
+      <w:r>
+        <w:br/>
+        <w:t xml:space="preserve"/>
+      </w:r>
+      <w:r>
+        <w:rPr>
+          <w:rFonts w:ascii="Calibri" w:cs="Calibri" w:eastAsia="Calibri" w:hAnsi="Calibri"/>
+          <w:color w:val="000000"/>
+          <w:sz w:val="24"/>
+          <w:szCs w:val="24"/>
+        </w:rPr>
+        <w:t xml:space="preserve">Y sin rendición de cuentas, un derecho reconocido por la ONU y por la ley mexicana</w:t>
+      </w:r>
+      <w:r>
+        <w:br/>
+        <w:t xml:space="preserve"/>
+      </w:r>
+      <w:r>
+        <w:rPr>
+          <w:rFonts w:ascii="Calibri" w:cs="Calibri" w:eastAsia="Calibri" w:hAnsi="Calibri"/>
+          <w:color w:val="000000"/>
+          <w:sz w:val="24"/>
+          <w:szCs w:val="24"/>
+        </w:rPr>
+        <w:t xml:space="preserve">— el derecho a un cuidado digno y de calidad —</w:t>
+      </w:r>
+      <w:r>
+        <w:br/>
+        <w:t xml:space="preserve"/>
+      </w:r>
+      <w:r>
+        <w:rPr>
+          <w:rFonts w:ascii="Calibri" w:cs="Calibri" w:eastAsia="Calibri" w:hAnsi="Calibri"/>
+          <w:color w:val="000000"/>
+          <w:sz w:val="24"/>
+          <w:szCs w:val="24"/>
+        </w:rPr>
+        <w:t xml:space="preserve">se vuelve invisible e inauditable.</w:t>
       </w:r>
       <w:r>
         <w:br/>

</xml_diff>

<commit_message>
E3: bloque 1 — NOM-031 y riesgo permanente integrados
Agrega argumento normativo: NOM-031 exige registros permanentes y
cualquier inspección/queja/demanda llega sin aviso. Refuerza el
fallo administrativo con consecuencia legal concreta y continua.

Co-Authored-By: Claude Sonnet 4.6 <noreply@anthropic.com>
</commit_message>
<xml_diff>
--- a/business/CareSignal_Pitch_Guion_4min.docx
+++ b/business/CareSignal_Pitch_Guion_4min.docx
@@ -1419,46 +1419,85 @@
           <w:sz w:val="24"/>
           <w:szCs w:val="24"/>
         </w:rPr>
-        <w:t xml:space="preserve">¿Qué pasa cuando ningún cuidador sabe si alguien fue a verla a las 3 de la mañana</w:t>
-      </w:r>
-      <w:r>
-        <w:br/>
-        <w:t xml:space="preserve"/>
-      </w:r>
-      <w:r>
-        <w:rPr>
-          <w:rFonts w:ascii="Calibri" w:cs="Calibri" w:eastAsia="Calibri" w:hAnsi="Calibri"/>
-          <w:color w:val="000000"/>
-          <w:sz w:val="24"/>
-          <w:szCs w:val="24"/>
-        </w:rPr>
-        <w:t xml:space="preserve">— o si la ronda simplemente no ocurrió?</w:t>
-      </w:r>
-      <w:r>
-        <w:br/>
-        <w:t xml:space="preserve"/>
-      </w:r>
-      <w:r>
-        <w:rPr>
-          <w:rFonts w:ascii="Calibri" w:cs="Calibri" w:eastAsia="Calibri" w:hAnsi="Calibri"/>
-          <w:color w:val="000000"/>
-          <w:sz w:val="24"/>
-          <w:szCs w:val="24"/>
-        </w:rPr>
-        <w:t xml:space="preserve">¿Cuándo el único registro de atención es un cuaderno que puede perderse,</w:t>
-      </w:r>
-      <w:r>
-        <w:br/>
-        <w:t xml:space="preserve"/>
-      </w:r>
-      <w:r>
-        <w:rPr>
-          <w:rFonts w:ascii="Calibri" w:cs="Calibri" w:eastAsia="Calibri" w:hAnsi="Calibri"/>
-          <w:color w:val="000000"/>
-          <w:sz w:val="24"/>
-          <w:szCs w:val="24"/>
-        </w:rPr>
-        <w:t xml:space="preserve">un grupo de WhatsApp que nadie revisa, o simplemente no existe?</w:t>
+        <w:t xml:space="preserve">¿Qué pasa cuando ningún cuidador sabe si alguien fue a ver a ese residente</w:t>
+      </w:r>
+      <w:r>
+        <w:br/>
+        <w:t xml:space="preserve"/>
+      </w:r>
+      <w:r>
+        <w:rPr>
+          <w:rFonts w:ascii="Calibri" w:cs="Calibri" w:eastAsia="Calibri" w:hAnsi="Calibri"/>
+          <w:color w:val="000000"/>
+          <w:sz w:val="24"/>
+          <w:szCs w:val="24"/>
+        </w:rPr>
+        <w:t xml:space="preserve">a las 3 de la mañana — o si la ronda simplemente no ocurrió?</w:t>
+      </w:r>
+      <w:r>
+        <w:br/>
+        <w:t xml:space="preserve"/>
+      </w:r>
+      <w:r>
+        <w:rPr>
+          <w:rFonts w:ascii="Calibri" w:cs="Calibri" w:eastAsia="Calibri" w:hAnsi="Calibri"/>
+          <w:color w:val="000000"/>
+          <w:sz w:val="24"/>
+          <w:szCs w:val="24"/>
+        </w:rPr>
+        <w:t xml:space="preserve">Ese es el fallo operativo: el cuidado que debía suceder, no sucedió</w:t>
+      </w:r>
+      <w:r>
+        <w:br/>
+        <w:t xml:space="preserve"/>
+      </w:r>
+      <w:r>
+        <w:rPr>
+          <w:rFonts w:ascii="Calibri" w:cs="Calibri" w:eastAsia="Calibri" w:hAnsi="Calibri"/>
+          <w:color w:val="000000"/>
+          <w:sz w:val="24"/>
+          <w:szCs w:val="24"/>
+        </w:rPr>
+        <w:t xml:space="preserve">— y nadie lo sabe hasta que es tarde.</w:t>
+      </w:r>
+      <w:r>
+        <w:br/>
+        <w:t xml:space="preserve"/>
+      </w:r>
+      <w:r>
+        <w:rPr>
+          <w:rFonts w:ascii="Calibri" w:cs="Calibri" w:eastAsia="Calibri" w:hAnsi="Calibri"/>
+          <w:color w:val="000000"/>
+          <w:sz w:val="24"/>
+          <w:szCs w:val="24"/>
+        </w:rPr>
+        <w:t xml:space="preserve">Una residencia de 50 residentes realiza cerca de 450 rondas por semana.</w:t>
+      </w:r>
+      <w:r>
+        <w:br/>
+        <w:t xml:space="preserve"/>
+      </w:r>
+      <w:r>
+        <w:rPr>
+          <w:rFonts w:ascii="Calibri" w:cs="Calibri" w:eastAsia="Calibri" w:hAnsi="Calibri"/>
+          <w:color w:val="000000"/>
+          <w:sz w:val="24"/>
+          <w:szCs w:val="24"/>
+        </w:rPr>
+        <w:t xml:space="preserve">Sin un sistema, no hay forma de saber cuántas ocurrieron,</w:t>
+      </w:r>
+      <w:r>
+        <w:br/>
+        <w:t xml:space="preserve"/>
+      </w:r>
+      <w:r>
+        <w:rPr>
+          <w:rFonts w:ascii="Calibri" w:cs="Calibri" w:eastAsia="Calibri" w:hAnsi="Calibri"/>
+          <w:color w:val="000000"/>
+          <w:sz w:val="24"/>
+          <w:szCs w:val="24"/>
+        </w:rPr>
+        <w:t xml:space="preserve">cuántas se retrasaron, ni quién fue responsable.</w:t>
       </w:r>
       <w:r>
         <w:br/>
@@ -1483,6 +1522,83 @@
           <w:sz w:val="24"/>
           <w:szCs w:val="24"/>
         </w:rPr>
+        <w:t xml:space="preserve">¿Y qué pasa cuando ese evento no quedó registrado en ningún lugar confiable</w:t>
+      </w:r>
+      <w:r>
+        <w:br/>
+        <w:t xml:space="preserve"/>
+      </w:r>
+      <w:r>
+        <w:rPr>
+          <w:rFonts w:ascii="Calibri" w:cs="Calibri" w:eastAsia="Calibri" w:hAnsi="Calibri"/>
+          <w:color w:val="000000"/>
+          <w:sz w:val="24"/>
+          <w:szCs w:val="24"/>
+        </w:rPr>
+        <w:t xml:space="preserve">— solo en un cuaderno que puede perderse, un WhatsApp que nadie revisa,</w:t>
+      </w:r>
+      <w:r>
+        <w:br/>
+        <w:t xml:space="preserve"/>
+      </w:r>
+      <w:r>
+        <w:rPr>
+          <w:rFonts w:ascii="Calibri" w:cs="Calibri" w:eastAsia="Calibri" w:hAnsi="Calibri"/>
+          <w:color w:val="000000"/>
+          <w:sz w:val="24"/>
+          <w:szCs w:val="24"/>
+        </w:rPr>
+        <w:t xml:space="preserve">o simplemente no existe?</w:t>
+      </w:r>
+      <w:r>
+        <w:br/>
+        <w:t xml:space="preserve"/>
+      </w:r>
+      <w:r>
+        <w:rPr>
+          <w:rFonts w:ascii="Calibri" w:cs="Calibri" w:eastAsia="Calibri" w:hAnsi="Calibri"/>
+          <w:color w:val="000000"/>
+          <w:sz w:val="24"/>
+          <w:szCs w:val="24"/>
+        </w:rPr>
+        <w:t xml:space="preserve">Ese es el fallo administrativo: sin registro auditable, el director no puede</w:t>
+      </w:r>
+      <w:r>
+        <w:br/>
+        <w:t xml:space="preserve"/>
+      </w:r>
+      <w:r>
+        <w:rPr>
+          <w:rFonts w:ascii="Calibri" w:cs="Calibri" w:eastAsia="Calibri" w:hAnsi="Calibri"/>
+          <w:color w:val="000000"/>
+          <w:sz w:val="24"/>
+          <w:szCs w:val="24"/>
+        </w:rPr>
+        <w:t xml:space="preserve">demostrar qué ocurrió — ni ante la familia, ni ante una inspección, ni ante un juez.</w:t>
+      </w:r>
+      <w:r>
+        <w:br/>
+        <w:t xml:space="preserve"/>
+      </w:r>
+      <w:r>
+        <w:rPr>
+          <w:rFonts w:ascii="Calibri" w:cs="Calibri" w:eastAsia="Calibri" w:hAnsi="Calibri"/>
+          <w:sz w:val="24"/>
+          <w:szCs w:val="24"/>
+        </w:rPr>
+        <w:t xml:space="preserve"> </w:t>
+      </w:r>
+      <w:r>
+        <w:br/>
+        <w:t xml:space="preserve"/>
+      </w:r>
+      <w:r>
+        <w:rPr>
+          <w:rFonts w:ascii="Calibri" w:cs="Calibri" w:eastAsia="Calibri" w:hAnsi="Calibri"/>
+          <w:color w:val="000000"/>
+          <w:sz w:val="24"/>
+          <w:szCs w:val="24"/>
+        </w:rPr>
         <w:t xml:space="preserve">En un informe de la CNDH se documentaron condiciones de abandono,</w:t>
       </w:r>
       <w:r>
@@ -1523,6 +1639,69 @@
           <w:szCs w:val="24"/>
         </w:rPr>
         <w:t xml:space="preserve">que el cuidado ocurrió, en el momento correcto, con la persona correcta.</w:t>
+      </w:r>
+      <w:r>
+        <w:br/>
+        <w:t xml:space="preserve"/>
+      </w:r>
+      <w:r>
+        <w:rPr>
+          <w:rFonts w:ascii="Calibri" w:cs="Calibri" w:eastAsia="Calibri" w:hAnsi="Calibri"/>
+          <w:sz w:val="24"/>
+          <w:szCs w:val="24"/>
+        </w:rPr>
+        <w:t xml:space="preserve"> </w:t>
+      </w:r>
+      <w:r>
+        <w:br/>
+        <w:t xml:space="preserve"/>
+      </w:r>
+      <w:r>
+        <w:rPr>
+          <w:rFonts w:ascii="Calibri" w:cs="Calibri" w:eastAsia="Calibri" w:hAnsi="Calibri"/>
+          <w:color w:val="000000"/>
+          <w:sz w:val="24"/>
+          <w:szCs w:val="24"/>
+        </w:rPr>
+        <w:t xml:space="preserve">La NOM-031 exige registros administrativos permanentes.</w:t>
+      </w:r>
+      <w:r>
+        <w:br/>
+        <w:t xml:space="preserve"/>
+      </w:r>
+      <w:r>
+        <w:rPr>
+          <w:rFonts w:ascii="Calibri" w:cs="Calibri" w:eastAsia="Calibri" w:hAnsi="Calibri"/>
+          <w:color w:val="000000"/>
+          <w:sz w:val="24"/>
+          <w:szCs w:val="24"/>
+        </w:rPr>
+        <w:t xml:space="preserve">Y cualquier inspección, queja familiar o demanda civil puede llegar sin aviso.</w:t>
+      </w:r>
+      <w:r>
+        <w:br/>
+        <w:t xml:space="preserve"/>
+      </w:r>
+      <w:r>
+        <w:rPr>
+          <w:rFonts w:ascii="Calibri" w:cs="Calibri" w:eastAsia="Calibri" w:hAnsi="Calibri"/>
+          <w:color w:val="000000"/>
+          <w:sz w:val="24"/>
+          <w:szCs w:val="24"/>
+        </w:rPr>
+        <w:t xml:space="preserve">El director que no tiene evidencia auditable está expuesto en todo momento.</w:t>
+      </w:r>
+      <w:r>
+        <w:br/>
+        <w:t xml:space="preserve"/>
+      </w:r>
+      <w:r>
+        <w:rPr>
+          <w:rFonts w:ascii="Calibri" w:cs="Calibri" w:eastAsia="Calibri" w:hAnsi="Calibri"/>
+          <w:sz w:val="24"/>
+          <w:szCs w:val="24"/>
+        </w:rPr>
+        <w:t xml:space="preserve"> </w:t>
       </w:r>
       <w:r>
         <w:br/>

</xml_diff>

<commit_message>
E3: guion pitch — bloques 2-7 recalculados para 4:00 exactos
Bloque 1 se mantiene (95 s). Bloques 2-7 comprimidos y reenfocados:
B2 30s · B3 25s · B4 20s · B5 25s (tracción+modelo fusionados)
B6 20s · B7 25s (cierre: oportunidad en lugar de multa redundante)
Total: 4:00 exactos.

Co-Authored-By: Claude Sonnet 4.6 <noreply@anthropic.com>
</commit_message>
<xml_diff>
--- a/business/CareSignal_Pitch_Guion_4min.docx
+++ b/business/CareSignal_Pitch_Guion_4min.docx
@@ -1909,7 +1909,7 @@
           <w:sz w:val="20"/>
           <w:szCs w:val="20"/>
         </w:rPr>
-        <w:t xml:space="preserve">Objetivo: el juez entiende QUÉ hace el producto en 45 segundos.</w:t>
+        <w:t xml:space="preserve">Objetivo: responder los dos fallos del bloque 1 en 30 segundos.</w:t>
       </w:r>
       <w:r>
         <w:rPr>
@@ -1918,7 +1918,7 @@
           <w:sz w:val="20"/>
           <w:szCs w:val="20"/>
         </w:rPr>
-        <w:t xml:space="preserve">   ·   45 s   ·   Acumulado: 1:40</w:t>
+        <w:t xml:space="preserve">   ·   30 s   ·   Acumulado: 2:05</w:t>
       </w:r>
     </w:p>
     <w:p>
@@ -1934,7 +1934,7 @@
           <w:sz w:val="20"/>
           <w:szCs w:val="20"/>
         </w:rPr>
-        <w:t xml:space="preserve">⏱ Si hay pantalla disponible, muestra el dashboard en este momento.</w:t>
+        <w:t xml:space="preserve">⏱ El bloque 1 ya plantó el problema — la solución va directa y rápida.</w:t>
       </w:r>
     </w:p>
     <w:p>
@@ -1952,122 +1952,72 @@
           <w:sz w:val="24"/>
           <w:szCs w:val="24"/>
         </w:rPr>
-        <w:t xml:space="preserve">"CareSignal digitaliza el ciclo operativo completo de una ronda de cuidado:</w:t>
-      </w:r>
-      <w:r>
-        <w:br/>
-        <w:t xml:space="preserve"/>
-      </w:r>
-      <w:r>
-        <w:rPr>
-          <w:rFonts w:ascii="Calibri" w:cs="Calibri" w:eastAsia="Calibri" w:hAnsi="Calibri"/>
-          <w:color w:val="000000"/>
-          <w:sz w:val="24"/>
-          <w:szCs w:val="24"/>
-        </w:rPr>
-        <w:t xml:space="preserve">el cuidador la ejecuta en 3 acciones desde su teléfono.</w:t>
-      </w:r>
-      <w:r>
-        <w:br/>
-        <w:t xml:space="preserve"/>
-      </w:r>
-      <w:r>
-        <w:rPr>
-          <w:rFonts w:ascii="Calibri" w:cs="Calibri" w:eastAsia="Calibri" w:hAnsi="Calibri"/>
-          <w:color w:val="000000"/>
-          <w:sz w:val="24"/>
-          <w:szCs w:val="24"/>
-        </w:rPr>
-        <w:t xml:space="preserve">Si se retrasa — el sistema lo detecta solo y avisa al supervisor en tiempo real.</w:t>
-      </w:r>
-      <w:r>
-        <w:br/>
-        <w:t xml:space="preserve"/>
-      </w:r>
-      <w:r>
-        <w:rPr>
-          <w:rFonts w:ascii="Calibri" w:cs="Calibri" w:eastAsia="Calibri" w:hAnsi="Calibri"/>
-          <w:sz w:val="24"/>
-          <w:szCs w:val="24"/>
-        </w:rPr>
-        <w:t xml:space="preserve"> </w:t>
-      </w:r>
-      <w:r>
-        <w:br/>
-        <w:t xml:space="preserve"/>
-      </w:r>
-      <w:r>
-        <w:rPr>
-          <w:rFonts w:ascii="Calibri" w:cs="Calibri" w:eastAsia="Calibri" w:hAnsi="Calibri"/>
-          <w:color w:val="000000"/>
-          <w:sz w:val="24"/>
-          <w:szCs w:val="24"/>
-        </w:rPr>
-        <w:t xml:space="preserve">Cada acción queda registrada: quién, cuándo, qué resultado.</w:t>
-      </w:r>
-      <w:r>
-        <w:br/>
-        <w:t xml:space="preserve"/>
-      </w:r>
-      <w:r>
-        <w:rPr>
-          <w:rFonts w:ascii="Calibri" w:cs="Calibri" w:eastAsia="Calibri" w:hAnsi="Calibri"/>
-          <w:color w:val="000000"/>
-          <w:sz w:val="24"/>
-          <w:szCs w:val="24"/>
-        </w:rPr>
-        <w:t xml:space="preserve">Una bitácora inmutable que se genera sola — sin papel, sin transcripción,</w:t>
-      </w:r>
-      <w:r>
-        <w:br/>
-        <w:t xml:space="preserve"/>
-      </w:r>
-      <w:r>
-        <w:rPr>
-          <w:rFonts w:ascii="Calibri" w:cs="Calibri" w:eastAsia="Calibri" w:hAnsi="Calibri"/>
-          <w:color w:val="000000"/>
-          <w:sz w:val="24"/>
-          <w:szCs w:val="24"/>
-        </w:rPr>
-        <w:t xml:space="preserve">sin trabajo extra.</w:t>
-      </w:r>
-      <w:r>
-        <w:br/>
-        <w:t xml:space="preserve"/>
-      </w:r>
-      <w:r>
-        <w:rPr>
-          <w:rFonts w:ascii="Calibri" w:cs="Calibri" w:eastAsia="Calibri" w:hAnsi="Calibri"/>
-          <w:sz w:val="24"/>
-          <w:szCs w:val="24"/>
-        </w:rPr>
-        <w:t xml:space="preserve"> </w:t>
-      </w:r>
-      <w:r>
-        <w:br/>
-        <w:t xml:space="preserve"/>
-      </w:r>
-      <w:r>
-        <w:rPr>
-          <w:rFonts w:ascii="Calibri" w:cs="Calibri" w:eastAsia="Calibri" w:hAnsi="Calibri"/>
-          <w:color w:val="000000"/>
-          <w:sz w:val="24"/>
-          <w:szCs w:val="24"/>
-        </w:rPr>
-        <w:t xml:space="preserve">El familiar que pregunta por su mamá tiene una respuesta en segundos.</w:t>
-      </w:r>
-      <w:r>
-        <w:br/>
-        <w:t xml:space="preserve"/>
-      </w:r>
-      <w:r>
-        <w:rPr>
-          <w:rFonts w:ascii="Calibri" w:cs="Calibri" w:eastAsia="Calibri" w:hAnsi="Calibri"/>
-          <w:color w:val="000000"/>
-          <w:sz w:val="24"/>
-          <w:szCs w:val="24"/>
-        </w:rPr>
-        <w:t xml:space="preserve">El director que enfrenta una inspección tiene evidencia lista."</w:t>
+        <w:t xml:space="preserve">"CareSignal resuelve los dos fallos.</w:t>
+      </w:r>
+      <w:r>
+        <w:br/>
+        <w:t xml:space="preserve"/>
+      </w:r>
+      <w:r>
+        <w:rPr>
+          <w:rFonts w:ascii="Calibri" w:cs="Calibri" w:eastAsia="Calibri" w:hAnsi="Calibri"/>
+          <w:color w:val="000000"/>
+          <w:sz w:val="24"/>
+          <w:szCs w:val="24"/>
+        </w:rPr>
+        <w:t xml:space="preserve">El operativo: detecta automáticamente cuando una ronda no ocurre</w:t>
+      </w:r>
+      <w:r>
+        <w:br/>
+        <w:t xml:space="preserve"/>
+      </w:r>
+      <w:r>
+        <w:rPr>
+          <w:rFonts w:ascii="Calibri" w:cs="Calibri" w:eastAsia="Calibri" w:hAnsi="Calibri"/>
+          <w:color w:val="000000"/>
+          <w:sz w:val="24"/>
+          <w:szCs w:val="24"/>
+        </w:rPr>
+        <w:t xml:space="preserve">y alerta al supervisor en tiempo real.</w:t>
+      </w:r>
+      <w:r>
+        <w:br/>
+        <w:t xml:space="preserve"/>
+      </w:r>
+      <w:r>
+        <w:rPr>
+          <w:rFonts w:ascii="Calibri" w:cs="Calibri" w:eastAsia="Calibri" w:hAnsi="Calibri"/>
+          <w:color w:val="000000"/>
+          <w:sz w:val="24"/>
+          <w:szCs w:val="24"/>
+        </w:rPr>
+        <w:t xml:space="preserve">El administrativo: genera una bitácora inmutable — quién, cuándo, qué resultado —</w:t>
+      </w:r>
+      <w:r>
+        <w:br/>
+        <w:t xml:space="preserve"/>
+      </w:r>
+      <w:r>
+        <w:rPr>
+          <w:rFonts w:ascii="Calibri" w:cs="Calibri" w:eastAsia="Calibri" w:hAnsi="Calibri"/>
+          <w:color w:val="000000"/>
+          <w:sz w:val="24"/>
+          <w:szCs w:val="24"/>
+        </w:rPr>
+        <w:t xml:space="preserve">sin papel, sin transcripción, sin trabajo extra.</w:t>
+      </w:r>
+      <w:r>
+        <w:br/>
+        <w:t xml:space="preserve"/>
+      </w:r>
+      <w:r>
+        <w:rPr>
+          <w:rFonts w:ascii="Calibri" w:cs="Calibri" w:eastAsia="Calibri" w:hAnsi="Calibri"/>
+          <w:color w:val="000000"/>
+          <w:sz w:val="24"/>
+          <w:szCs w:val="24"/>
+        </w:rPr>
+        <w:t xml:space="preserve">El director tiene evidencia lista ante cualquier inspección, queja o demanda."</w:t>
       </w:r>
     </w:p>
     <w:p>
@@ -2108,7 +2058,7 @@
           <w:sz w:val="20"/>
           <w:szCs w:val="20"/>
         </w:rPr>
-        <w:t xml:space="preserve">Objetivo: dimensionar la oportunidad con datos creíbles.</w:t>
+        <w:t xml:space="preserve">Objetivo: SAM y potencial de ingresos en 25 segundos.</w:t>
       </w:r>
       <w:r>
         <w:rPr>
@@ -2117,7 +2067,7 @@
           <w:sz w:val="20"/>
           <w:szCs w:val="20"/>
         </w:rPr>
-        <w:t xml:space="preserve">   ·   35 s   ·   Acumulado: 2:15</w:t>
+        <w:t xml:space="preserve">   ·   25 s   ·   Acumulado: 2:30</w:t>
       </w:r>
     </w:p>
     <w:p>
@@ -2133,7 +2083,7 @@
           <w:sz w:val="20"/>
           <w:szCs w:val="20"/>
         </w:rPr>
-        <w:t xml:space="preserve">⏱ Si el tiempo aprieta, corta la última oración de los ingresos.</w:t>
+        <w:t xml:space="preserve">⏱ El tamaño global ya se dijo en el bloque 1 — aquí solo el mercado accionable.</w:t>
       </w:r>
     </w:p>
     <w:p>
@@ -2151,83 +2101,7 @@
           <w:sz w:val="24"/>
           <w:szCs w:val="24"/>
         </w:rPr>
-        <w:t xml:space="preserve">"Son más de 1,300 residencias privadas formales en México.</w:t>
-      </w:r>
-      <w:r>
-        <w:br/>
-        <w:t xml:space="preserve"/>
-      </w:r>
-      <w:r>
-        <w:rPr>
-          <w:rFonts w:ascii="Calibri" w:cs="Calibri" w:eastAsia="Calibri" w:hAnsi="Calibri"/>
-          <w:color w:val="000000"/>
-          <w:sz w:val="24"/>
-          <w:szCs w:val="24"/>
-        </w:rPr>
-        <w:t xml:space="preserve">Crecen al 18% cada año.</w:t>
-      </w:r>
-      <w:r>
-        <w:br/>
-        <w:t xml:space="preserve"/>
-      </w:r>
-      <w:r>
-        <w:rPr>
-          <w:rFonts w:ascii="Calibri" w:cs="Calibri" w:eastAsia="Calibri" w:hAnsi="Calibri"/>
-          <w:color w:val="000000"/>
-          <w:sz w:val="24"/>
-          <w:szCs w:val="24"/>
-        </w:rPr>
-        <w:t xml:space="preserve">La ley — la NOM-031 — ya exige los registros.</w:t>
-      </w:r>
-      <w:r>
-        <w:br/>
-        <w:t xml:space="preserve"/>
-      </w:r>
-      <w:r>
-        <w:rPr>
-          <w:rFonts w:ascii="Calibri" w:cs="Calibri" w:eastAsia="Calibri" w:hAnsi="Calibri"/>
-          <w:color w:val="000000"/>
-          <w:sz w:val="24"/>
-          <w:szCs w:val="24"/>
-        </w:rPr>
-        <w:t xml:space="preserve">Pero menos del 4% fueron supervisadas durante la pandemia.</w:t>
-      </w:r>
-      <w:r>
-        <w:br/>
-        <w:t xml:space="preserve"/>
-      </w:r>
-      <w:r>
-        <w:rPr>
-          <w:rFonts w:ascii="Calibri" w:cs="Calibri" w:eastAsia="Calibri" w:hAnsi="Calibri"/>
-          <w:sz w:val="24"/>
-          <w:szCs w:val="24"/>
-        </w:rPr>
-        <w:t xml:space="preserve"> </w:t>
-      </w:r>
-      <w:r>
-        <w:br/>
-        <w:t xml:space="preserve"/>
-      </w:r>
-      <w:r>
-        <w:rPr>
-          <w:rFonts w:ascii="Calibri" w:cs="Calibri" w:eastAsia="Calibri" w:hAnsi="Calibri"/>
-          <w:color w:val="000000"/>
-          <w:sz w:val="24"/>
-          <w:szCs w:val="24"/>
-        </w:rPr>
-        <w:t xml:space="preserve">El que llega digitalizado primero, llega protegido.</w:t>
-      </w:r>
-      <w:r>
-        <w:br/>
-        <w:t xml:space="preserve"/>
-      </w:r>
-      <w:r>
-        <w:rPr>
-          <w:rFonts w:ascii="Calibri" w:cs="Calibri" w:eastAsia="Calibri" w:hAnsi="Calibri"/>
-          <w:sz w:val="24"/>
-          <w:szCs w:val="24"/>
-        </w:rPr>
-        <w:t xml:space="preserve"> </w:t>
+        <w:t xml:space="preserve">"Son más de 1,300 residencias privadas en México, creciendo al 18% anual.</w:t>
       </w:r>
       <w:r>
         <w:br/>
@@ -2253,20 +2127,7 @@
           <w:sz w:val="24"/>
           <w:szCs w:val="24"/>
         </w:rPr>
-        <w:t xml:space="preserve">A precio Profesional, eso equivale a entre 175,000 y 700,000</w:t>
-      </w:r>
-      <w:r>
-        <w:br/>
-        <w:t xml:space="preserve"/>
-      </w:r>
-      <w:r>
-        <w:rPr>
-          <w:rFonts w:ascii="Calibri" w:cs="Calibri" w:eastAsia="Calibri" w:hAnsi="Calibri"/>
-          <w:color w:val="000000"/>
-          <w:sz w:val="24"/>
-          <w:szCs w:val="24"/>
-        </w:rPr>
-        <w:t xml:space="preserve">pesos mensuales recurrentes."</w:t>
+        <w:t xml:space="preserve">A precio Profesional, entre 175,000 y 700,000 pesos mensuales recurrentes."</w:t>
       </w:r>
     </w:p>
     <w:p>
@@ -2307,7 +2168,7 @@
           <w:sz w:val="20"/>
           <w:szCs w:val="20"/>
         </w:rPr>
-        <w:t xml:space="preserve">Objetivo: dejar claro por qué nadie más lo está haciendo.</w:t>
+        <w:t xml:space="preserve">Objetivo: un golpe limpio — por qué nadie más lo hace.</w:t>
       </w:r>
       <w:r>
         <w:rPr>
@@ -2316,7 +2177,7 @@
           <w:sz w:val="20"/>
           <w:szCs w:val="20"/>
         </w:rPr>
-        <w:t xml:space="preserve">   ·   25 s   ·   Acumulado: 2:40</w:t>
+        <w:t xml:space="preserve">   ·   20 s   ·   Acumulado: 2:50</w:t>
       </w:r>
     </w:p>
     <w:p>
@@ -2350,20 +2211,7 @@
           <w:sz w:val="24"/>
           <w:szCs w:val="24"/>
         </w:rPr>
-        <w:t xml:space="preserve">"Los competidores en México — Cronos Care, GERIGES — son sistemas</w:t>
-      </w:r>
-      <w:r>
-        <w:br/>
-        <w:t xml:space="preserve"/>
-      </w:r>
-      <w:r>
-        <w:rPr>
-          <w:rFonts w:ascii="Calibri" w:cs="Calibri" w:eastAsia="Calibri" w:hAnsi="Calibri"/>
-          <w:color w:val="000000"/>
-          <w:sz w:val="24"/>
-          <w:szCs w:val="24"/>
-        </w:rPr>
-        <w:t xml:space="preserve">de expediente y administración.</w:t>
+        <w:t xml:space="preserve">"Los competidores — Cronos Care, GERIGES — son sistemas de expediente.</w:t>
       </w:r>
       <w:r>
         <w:br/>
@@ -2389,19 +2237,6 @@
           <w:sz w:val="24"/>
           <w:szCs w:val="24"/>
         </w:rPr>
-        <w:t xml:space="preserve">Ninguno dispara una alerta automática.</w:t>
-      </w:r>
-      <w:r>
-        <w:br/>
-        <w:t xml:space="preserve"/>
-      </w:r>
-      <w:r>
-        <w:rPr>
-          <w:rFonts w:ascii="Calibri" w:cs="Calibri" w:eastAsia="Calibri" w:hAnsi="Calibri"/>
-          <w:color w:val="000000"/>
-          <w:sz w:val="24"/>
-          <w:szCs w:val="24"/>
-        </w:rPr>
         <w:t xml:space="preserve">Ninguno tiene precio publicado.</w:t>
       </w:r>
       <w:r>
@@ -2411,36 +2246,11 @@
       <w:r>
         <w:rPr>
           <w:rFonts w:ascii="Calibri" w:cs="Calibri" w:eastAsia="Calibri" w:hAnsi="Calibri"/>
-          <w:sz w:val="24"/>
-          <w:szCs w:val="24"/>
-        </w:rPr>
-        <w:t xml:space="preserve"> </w:t>
-      </w:r>
-      <w:r>
-        <w:br/>
-        <w:t xml:space="preserve"/>
-      </w:r>
-      <w:r>
-        <w:rPr>
-          <w:rFonts w:ascii="Calibri" w:cs="Calibri" w:eastAsia="Calibri" w:hAnsi="Calibri"/>
-          <w:color w:val="000000"/>
-          <w:sz w:val="24"/>
-          <w:szCs w:val="24"/>
-        </w:rPr>
-        <w:t xml:space="preserve">CareSignal es la única plataforma diseñada específicamente</w:t>
-      </w:r>
-      <w:r>
-        <w:br/>
-        <w:t xml:space="preserve"/>
-      </w:r>
-      <w:r>
-        <w:rPr>
-          <w:rFonts w:ascii="Calibri" w:cs="Calibri" w:eastAsia="Calibri" w:hAnsi="Calibri"/>
-          <w:color w:val="000000"/>
-          <w:sz w:val="24"/>
-          <w:szCs w:val="24"/>
-        </w:rPr>
-        <w:t xml:space="preserve">para ese ciclo operativo."</w:t>
+          <w:color w:val="000000"/>
+          <w:sz w:val="24"/>
+          <w:szCs w:val="24"/>
+        </w:rPr>
+        <w:t xml:space="preserve">CareSignal es la única plataforma diseñada para el ciclo operativo de la ronda."</w:t>
       </w:r>
     </w:p>
     <w:p>
@@ -2465,7 +2275,7 @@
           <w:sz w:val="28"/>
           <w:szCs w:val="28"/>
         </w:rPr>
-        <w:t xml:space="preserve">Bloque 5 · Tracción / Prueba</w:t>
+        <w:t xml:space="preserve">Bloque 5 · Tracción + Modelo de negocio</w:t>
       </w:r>
     </w:p>
     <w:p>
@@ -2481,7 +2291,7 @@
           <w:sz w:val="20"/>
           <w:szCs w:val="20"/>
         </w:rPr>
-        <w:t xml:space="preserve">Objetivo: demostrar que el producto existe y funciona hoy.</w:t>
+        <w:t xml:space="preserve">Objetivo: producto terminado y precio en un solo bloque.</w:t>
       </w:r>
       <w:r>
         <w:rPr>
@@ -2490,7 +2300,7 @@
           <w:sz w:val="20"/>
           <w:szCs w:val="20"/>
         </w:rPr>
-        <w:t xml:space="preserve">   ·   25 s   ·   Acumulado: 3:05</w:t>
+        <w:t xml:space="preserve">   ·   25 s   ·   Acumulado: 3:15</w:t>
       </w:r>
     </w:p>
     <w:p>
@@ -2506,7 +2316,7 @@
           <w:sz w:val="20"/>
           <w:szCs w:val="20"/>
         </w:rPr>
-        <w:t xml:space="preserve">⏱ Sube el ritmo — este bloque va rápido y con seguridad.</w:t>
+        <w:t xml:space="preserve">⏱ Ritmo rápido y seguro — cada número refuerza la credibilidad.</w:t>
       </w:r>
     </w:p>
     <w:p>
@@ -2537,71 +2347,33 @@
           <w:sz w:val="24"/>
           <w:szCs w:val="24"/>
         </w:rPr>
-        <w:t xml:space="preserve">38 pruebas automatizadas.</w:t>
-      </w:r>
-      <w:r>
-        <w:br/>
-        <w:t xml:space="preserve"/>
-      </w:r>
-      <w:r>
-        <w:rPr>
-          <w:rFonts w:ascii="Calibri" w:cs="Calibri" w:eastAsia="Calibri" w:hAnsi="Calibri"/>
-          <w:color w:val="000000"/>
-          <w:sz w:val="24"/>
-          <w:szCs w:val="24"/>
-        </w:rPr>
-        <w:t xml:space="preserve">20 pruebas de aceptación del contrato.</w:t>
-      </w:r>
-      <w:r>
-        <w:br/>
-        <w:t xml:space="preserve"/>
-      </w:r>
-      <w:r>
-        <w:rPr>
-          <w:rFonts w:ascii="Calibri" w:cs="Calibri" w:eastAsia="Calibri" w:hAnsi="Calibri"/>
-          <w:color w:val="000000"/>
-          <w:sz w:val="24"/>
-          <w:szCs w:val="24"/>
-        </w:rPr>
-        <w:t xml:space="preserve">Cero hallazgos bloqueantes.</w:t>
-      </w:r>
-      <w:r>
-        <w:br/>
-        <w:t xml:space="preserve"/>
-      </w:r>
-      <w:r>
-        <w:rPr>
-          <w:rFonts w:ascii="Calibri" w:cs="Calibri" w:eastAsia="Calibri" w:hAnsi="Calibri"/>
-          <w:color w:val="000000"/>
-          <w:sz w:val="24"/>
-          <w:szCs w:val="24"/>
-        </w:rPr>
-        <w:t xml:space="preserve">Auditoría con resultado PASS.</w:t>
-      </w:r>
-      <w:r>
-        <w:br/>
-        <w:t xml:space="preserve"/>
-      </w:r>
-      <w:r>
-        <w:rPr>
-          <w:rFonts w:ascii="Calibri" w:cs="Calibri" w:eastAsia="Calibri" w:hAnsi="Calibri"/>
-          <w:sz w:val="24"/>
-          <w:szCs w:val="24"/>
-        </w:rPr>
-        <w:t xml:space="preserve"> </w:t>
-      </w:r>
-      <w:r>
-        <w:br/>
-        <w:t xml:space="preserve"/>
-      </w:r>
-      <w:r>
-        <w:rPr>
-          <w:rFonts w:ascii="Calibri" w:cs="Calibri" w:eastAsia="Calibri" w:hAnsi="Calibri"/>
-          <w:color w:val="000000"/>
-          <w:sz w:val="24"/>
-          <w:szCs w:val="24"/>
-        </w:rPr>
-        <w:t xml:space="preserve">Se puede usar ahora mismo — sin instalación, sin cuenta, sin internet."</w:t>
+        <w:t xml:space="preserve">38 pruebas automatizadas. 20 de aceptación del contrato. Cero bloqueantes. Auditoría PASS.</w:t>
+      </w:r>
+      <w:r>
+        <w:br/>
+        <w:t xml:space="preserve"/>
+      </w:r>
+      <w:r>
+        <w:rPr>
+          <w:rFonts w:ascii="Calibri" w:cs="Calibri" w:eastAsia="Calibri" w:hAnsi="Calibri"/>
+          <w:color w:val="000000"/>
+          <w:sz w:val="24"/>
+          <w:szCs w:val="24"/>
+        </w:rPr>
+        <w:t xml:space="preserve">Tres planes desde 1,490 hasta 6,990 pesos por residencia al mes.</w:t>
+      </w:r>
+      <w:r>
+        <w:br/>
+        <w:t xml:space="preserve"/>
+      </w:r>
+      <w:r>
+        <w:rPr>
+          <w:rFonts w:ascii="Calibri" w:cs="Calibri" w:eastAsia="Calibri" w:hAnsi="Calibri"/>
+          <w:color w:val="000000"/>
+          <w:sz w:val="24"/>
+          <w:szCs w:val="24"/>
+        </w:rPr>
+        <w:t xml:space="preserve">Margen bruto superior al 97%."</w:t>
       </w:r>
     </w:p>
     <w:p>
@@ -2626,7 +2398,7 @@
           <w:sz w:val="28"/>
           <w:szCs w:val="28"/>
         </w:rPr>
-        <w:t xml:space="preserve">Bloque 6 · Modelo de negocio</w:t>
+        <w:t xml:space="preserve">Bloque 6 · IA y Ciberseguridad</w:t>
       </w:r>
     </w:p>
     <w:p>
@@ -2642,7 +2414,7 @@
           <w:sz w:val="20"/>
           <w:szCs w:val="20"/>
         </w:rPr>
-        <w:t xml:space="preserve">Objetivo: precio claro, margen impresionante.</w:t>
+        <w:t xml:space="preserve">Objetivo: alinear con el eje del concurso en 20 segundos.</w:t>
       </w:r>
       <w:r>
         <w:rPr>
@@ -2651,7 +2423,7 @@
           <w:sz w:val="20"/>
           <w:szCs w:val="20"/>
         </w:rPr>
-        <w:t xml:space="preserve">   ·   20 s   ·   Acumulado: 3:25</w:t>
+        <w:t xml:space="preserve">   ·   20 s   ·   Acumulado: 3:35</w:t>
       </w:r>
     </w:p>
     <w:p>
@@ -2667,7 +2439,7 @@
           <w:sz w:val="20"/>
           <w:szCs w:val="20"/>
         </w:rPr>
-        <w:t xml:space="preserve">⏱ Di los números con calma — que el juez los procese.</w:t>
+        <w:t xml:space="preserve">⏱ Conecta directamente con los criterios 1 y 11 del concurso.</w:t>
       </w:r>
     </w:p>
     <w:p>
@@ -2685,71 +2457,46 @@
           <w:sz w:val="24"/>
           <w:szCs w:val="24"/>
         </w:rPr>
-        <w:t xml:space="preserve">"Tres planes por residencia al mes:</w:t>
-      </w:r>
-      <w:r>
-        <w:br/>
-        <w:t xml:space="preserve"/>
-      </w:r>
-      <w:r>
-        <w:rPr>
-          <w:rFonts w:ascii="Calibri" w:cs="Calibri" w:eastAsia="Calibri" w:hAnsi="Calibri"/>
-          <w:color w:val="000000"/>
-          <w:sz w:val="24"/>
-          <w:szCs w:val="24"/>
-        </w:rPr>
-        <w:t xml:space="preserve">desde 1,490 hasta 6,990 pesos. Sin cobro por plaza.</w:t>
-      </w:r>
-      <w:r>
-        <w:br/>
-        <w:t xml:space="preserve"/>
-      </w:r>
-      <w:r>
-        <w:rPr>
-          <w:rFonts w:ascii="Calibri" w:cs="Calibri" w:eastAsia="Calibri" w:hAnsi="Calibri"/>
-          <w:sz w:val="24"/>
-          <w:szCs w:val="24"/>
-        </w:rPr>
-        <w:t xml:space="preserve"> </w:t>
-      </w:r>
-      <w:r>
-        <w:br/>
-        <w:t xml:space="preserve"/>
-      </w:r>
-      <w:r>
-        <w:rPr>
-          <w:rFonts w:ascii="Calibri" w:cs="Calibri" w:eastAsia="Calibri" w:hAnsi="Calibri"/>
-          <w:color w:val="000000"/>
-          <w:sz w:val="24"/>
-          <w:szCs w:val="24"/>
-        </w:rPr>
-        <w:t xml:space="preserve">Infraestructura en Google Cloud para 33 clientes:</w:t>
-      </w:r>
-      <w:r>
-        <w:br/>
-        <w:t xml:space="preserve"/>
-      </w:r>
-      <w:r>
-        <w:rPr>
-          <w:rFonts w:ascii="Calibri" w:cs="Calibri" w:eastAsia="Calibri" w:hAnsi="Calibri"/>
-          <w:color w:val="000000"/>
-          <w:sz w:val="24"/>
-          <w:szCs w:val="24"/>
-        </w:rPr>
-        <w:t xml:space="preserve">menos de 100 dólares al mes.</w:t>
-      </w:r>
-      <w:r>
-        <w:br/>
-        <w:t xml:space="preserve"/>
-      </w:r>
-      <w:r>
-        <w:rPr>
-          <w:rFonts w:ascii="Calibri" w:cs="Calibri" w:eastAsia="Calibri" w:hAnsi="Calibri"/>
-          <w:color w:val="000000"/>
-          <w:sz w:val="24"/>
-          <w:szCs w:val="24"/>
-        </w:rPr>
-        <w:t xml:space="preserve">Margen bruto superior al 97%."</w:t>
+        <w:t xml:space="preserve">"Los datos de adultos mayores son datos sensibles por ley — la LFPDPPP.</w:t>
+      </w:r>
+      <w:r>
+        <w:br/>
+        <w:t xml:space="preserve"/>
+      </w:r>
+      <w:r>
+        <w:rPr>
+          <w:rFonts w:ascii="Calibri" w:cs="Calibri" w:eastAsia="Calibri" w:hAnsi="Calibri"/>
+          <w:color w:val="000000"/>
+          <w:sz w:val="24"/>
+          <w:szCs w:val="24"/>
+        </w:rPr>
+        <w:t xml:space="preserve">CareSignal los estructura sobre Google Cloud Run y Firebase con cifrado extremo a extremo.</w:t>
+      </w:r>
+      <w:r>
+        <w:br/>
+        <w:t xml:space="preserve"/>
+      </w:r>
+      <w:r>
+        <w:rPr>
+          <w:rFonts w:ascii="Calibri" w:cs="Calibri" w:eastAsia="Calibri" w:hAnsi="Calibri"/>
+          <w:color w:val="000000"/>
+          <w:sz w:val="24"/>
+          <w:szCs w:val="24"/>
+        </w:rPr>
+        <w:t xml:space="preserve">La bitácora de 20 tipos de evento por turno es el insumo para alertas predictivas</w:t>
+      </w:r>
+      <w:r>
+        <w:br/>
+        <w:t xml:space="preserve"/>
+      </w:r>
+      <w:r>
+        <w:rPr>
+          <w:rFonts w:ascii="Calibri" w:cs="Calibri" w:eastAsia="Calibri" w:hAnsi="Calibri"/>
+          <w:color w:val="000000"/>
+          <w:sz w:val="24"/>
+          <w:szCs w:val="24"/>
+        </w:rPr>
+        <w:t xml:space="preserve">y un agente de ciberseguridad activo 24 horas sobre Gemini API de Google."</w:t>
       </w:r>
     </w:p>
     <w:p>
@@ -2774,7 +2521,7 @@
           <w:sz w:val="28"/>
           <w:szCs w:val="28"/>
         </w:rPr>
-        <w:t xml:space="preserve">Bloque 7 · IA y Ciberseguridad</w:t>
+        <w:t xml:space="preserve">Bloque 7 · Cierre</w:t>
       </w:r>
     </w:p>
     <w:p>
@@ -2790,7 +2537,7 @@
           <w:sz w:val="20"/>
           <w:szCs w:val="20"/>
         </w:rPr>
-        <w:t xml:space="preserve">Objetivo: alinear con el eje del concurso en 25 segundos.</w:t>
+        <w:t xml:space="preserve">Objetivo: oportunidad + llamada a la acción. Mirando al juez.</w:t>
       </w:r>
       <w:r>
         <w:rPr>
@@ -2799,7 +2546,7 @@
           <w:sz w:val="20"/>
           <w:szCs w:val="20"/>
         </w:rPr>
-        <w:t xml:space="preserve">   ·   25 s   ·   Acumulado: 3:50</w:t>
+        <w:t xml:space="preserve">   ·   25 s   ·   Acumulado: 4:00</w:t>
       </w:r>
     </w:p>
     <w:p>
@@ -2815,7 +2562,7 @@
           <w:sz w:val="20"/>
           <w:szCs w:val="20"/>
         </w:rPr>
-        <w:t xml:space="preserve">⏱ Este bloque cierra el argumento técnico — conecta con el criterio 11.</w:t>
+        <w:t xml:space="preserve">⏱ Baja el ritmo. "Gracias" se dice mirando al juez, no al guion.</w:t>
       </w:r>
     </w:p>
     <w:p>
@@ -2833,220 +2580,59 @@
           <w:sz w:val="24"/>
           <w:szCs w:val="24"/>
         </w:rPr>
-        <w:t xml:space="preserve">"Los datos de adultos mayores son datos sensibles por ley — la LFPDPPP.</w:t>
-      </w:r>
-      <w:r>
-        <w:br/>
-        <w:t xml:space="preserve"/>
-      </w:r>
-      <w:r>
-        <w:rPr>
-          <w:rFonts w:ascii="Calibri" w:cs="Calibri" w:eastAsia="Calibri" w:hAnsi="Calibri"/>
-          <w:color w:val="000000"/>
-          <w:sz w:val="24"/>
-          <w:szCs w:val="24"/>
-        </w:rPr>
-        <w:t xml:space="preserve">Hoy viven en cuadernos y grupos de WhatsApp sin ningún cifrado.</w:t>
-      </w:r>
-      <w:r>
-        <w:br/>
-        <w:t xml:space="preserve"/>
-      </w:r>
-      <w:r>
-        <w:rPr>
-          <w:rFonts w:ascii="Calibri" w:cs="Calibri" w:eastAsia="Calibri" w:hAnsi="Calibri"/>
-          <w:sz w:val="24"/>
-          <w:szCs w:val="24"/>
-        </w:rPr>
-        <w:t xml:space="preserve"> </w:t>
-      </w:r>
-      <w:r>
-        <w:br/>
-        <w:t xml:space="preserve"/>
-      </w:r>
-      <w:r>
-        <w:rPr>
-          <w:rFonts w:ascii="Calibri" w:cs="Calibri" w:eastAsia="Calibri" w:hAnsi="Calibri"/>
-          <w:color w:val="000000"/>
-          <w:sz w:val="24"/>
-          <w:szCs w:val="24"/>
-        </w:rPr>
-        <w:t xml:space="preserve">CareSignal los estructura sobre Google Cloud Run y Firebase</w:t>
-      </w:r>
-      <w:r>
-        <w:br/>
-        <w:t xml:space="preserve"/>
-      </w:r>
-      <w:r>
-        <w:rPr>
-          <w:rFonts w:ascii="Calibri" w:cs="Calibri" w:eastAsia="Calibri" w:hAnsi="Calibri"/>
-          <w:color w:val="000000"/>
-          <w:sz w:val="24"/>
-          <w:szCs w:val="24"/>
-        </w:rPr>
-        <w:t xml:space="preserve">con cifrado extremo a extremo.</w:t>
-      </w:r>
-      <w:r>
-        <w:br/>
-        <w:t xml:space="preserve"/>
-      </w:r>
-      <w:r>
-        <w:rPr>
-          <w:rFonts w:ascii="Calibri" w:cs="Calibri" w:eastAsia="Calibri" w:hAnsi="Calibri"/>
-          <w:color w:val="000000"/>
-          <w:sz w:val="24"/>
-          <w:szCs w:val="24"/>
-        </w:rPr>
-        <w:t xml:space="preserve">Y la bitácora que genera — 20 tipos de evento por turno —</w:t>
-      </w:r>
-      <w:r>
-        <w:br/>
-        <w:t xml:space="preserve"/>
-      </w:r>
-      <w:r>
-        <w:rPr>
-          <w:rFonts w:ascii="Calibri" w:cs="Calibri" w:eastAsia="Calibri" w:hAnsi="Calibri"/>
-          <w:color w:val="000000"/>
-          <w:sz w:val="24"/>
-          <w:szCs w:val="24"/>
-        </w:rPr>
-        <w:t xml:space="preserve">es el insumo exacto para alertas predictivas</w:t>
-      </w:r>
-      <w:r>
-        <w:br/>
-        <w:t xml:space="preserve"/>
-      </w:r>
-      <w:r>
-        <w:rPr>
-          <w:rFonts w:ascii="Calibri" w:cs="Calibri" w:eastAsia="Calibri" w:hAnsi="Calibri"/>
-          <w:color w:val="000000"/>
-          <w:sz w:val="24"/>
-          <w:szCs w:val="24"/>
-        </w:rPr>
-        <w:t xml:space="preserve">y un agente de ciberseguridad activo las 24 horas,</w:t>
-      </w:r>
-      <w:r>
-        <w:br/>
-        <w:t xml:space="preserve"/>
-      </w:r>
-      <w:r>
-        <w:rPr>
-          <w:rFonts w:ascii="Calibri" w:cs="Calibri" w:eastAsia="Calibri" w:hAnsi="Calibri"/>
-          <w:color w:val="000000"/>
-          <w:sz w:val="24"/>
-          <w:szCs w:val="24"/>
-        </w:rPr>
-        <w:t xml:space="preserve">sobre Gemini API de Google."</w:t>
-      </w:r>
-    </w:p>
-    <w:p>
-      <w:pPr>
-        <w:pBdr>
-          <w:bottom w:val="single" w:color="D6EAF8" w:sz="4"/>
-        </w:pBdr>
-        <w:spacing w:after="200"/>
-      </w:pPr>
-    </w:p>
-    <w:p>
-      <w:pPr>
-        <w:shd w:fill="1A5276" w:val="clear"/>
-        <w:spacing w:after="160" w:before="280"/>
-      </w:pPr>
-      <w:r>
-        <w:rPr>
-          <w:rFonts w:ascii="Calibri" w:cs="Calibri" w:eastAsia="Calibri" w:hAnsi="Calibri"/>
-          <w:b/>
-          <w:bCs/>
-          <w:color w:val="FFFFFF"/>
-          <w:sz w:val="28"/>
-          <w:szCs w:val="28"/>
-        </w:rPr>
-        <w:t xml:space="preserve">Bloque 8 · Cierre</w:t>
-      </w:r>
-    </w:p>
-    <w:p>
-      <w:pPr>
-        <w:spacing w:after="120" w:before="80"/>
-      </w:pPr>
-      <w:r>
-        <w:rPr>
-          <w:rFonts w:ascii="Calibri" w:cs="Calibri" w:eastAsia="Calibri" w:hAnsi="Calibri"/>
-          <w:b/>
-          <w:bCs/>
-          <w:color w:val="1A5276"/>
-          <w:sz w:val="20"/>
-          <w:szCs w:val="20"/>
-        </w:rPr>
-        <w:t xml:space="preserve">Objetivo: anclar el precio con un dato de riesgo y hacer la llamada a la acción.</w:t>
-      </w:r>
-      <w:r>
-        <w:rPr>
-          <w:rFonts w:ascii="Calibri" w:cs="Calibri" w:eastAsia="Calibri" w:hAnsi="Calibri"/>
-          <w:color w:val="424242"/>
-          <w:sz w:val="20"/>
-          <w:szCs w:val="20"/>
-        </w:rPr>
-        <w:t xml:space="preserve">   ·   20 s   ·   Acumulado: 4:10</w:t>
-      </w:r>
-    </w:p>
-    <w:p>
-      <w:pPr>
-        <w:spacing w:after="80"/>
-      </w:pPr>
-      <w:r>
-        <w:rPr>
-          <w:rFonts w:ascii="Calibri" w:cs="Calibri" w:eastAsia="Calibri" w:hAnsi="Calibri"/>
-          <w:i/>
-          <w:iCs/>
-          <w:color w:val="CA6F1E"/>
-          <w:sz w:val="20"/>
-          <w:szCs w:val="20"/>
-        </w:rPr>
-        <w:t xml:space="preserve">⏱ Baja el ritmo. La última oración se dice mirando al juez, no al guion.</w:t>
-      </w:r>
-    </w:p>
-    <w:p>
-      <w:pPr>
-        <w:pBdr>
-          <w:left w:val="single" w:color="1A5276" w:sz="12"/>
-        </w:pBdr>
-        <w:spacing w:after="200" w:before="120" w:line="320"/>
-        <w:ind w:left="680"/>
-      </w:pPr>
-      <w:r>
-        <w:rPr>
-          <w:rFonts w:ascii="Calibri" w:cs="Calibri" w:eastAsia="Calibri" w:hAnsi="Calibri"/>
-          <w:color w:val="000000"/>
-          <w:sz w:val="24"/>
-          <w:szCs w:val="24"/>
-        </w:rPr>
-        <w:t xml:space="preserve">"Una multa leve bajo la Ley General de Salud cuesta 234,000 pesos.</w:t>
-      </w:r>
-      <w:r>
-        <w:br/>
-        <w:t xml:space="preserve"/>
-      </w:r>
-      <w:r>
-        <w:rPr>
-          <w:rFonts w:ascii="Calibri" w:cs="Calibri" w:eastAsia="Calibri" w:hAnsi="Calibri"/>
-          <w:color w:val="000000"/>
-          <w:sz w:val="24"/>
-          <w:szCs w:val="24"/>
-        </w:rPr>
-        <w:t xml:space="preserve">CareSignal cuesta 17,880 al año.</w:t>
-      </w:r>
-      <w:r>
-        <w:br/>
-        <w:t xml:space="preserve"/>
-      </w:r>
-      <w:r>
-        <w:rPr>
-          <w:rFonts w:ascii="Calibri" w:cs="Calibri" w:eastAsia="Calibri" w:hAnsi="Calibri"/>
-          <w:color w:val="000000"/>
-          <w:sz w:val="24"/>
-          <w:szCs w:val="24"/>
-        </w:rPr>
-        <w:t xml:space="preserve">Es 13 veces más barato que la primera multa.</w:t>
+        <w:t xml:space="preserve">"El sector crece al 18% anual.</w:t>
+      </w:r>
+      <w:r>
+        <w:br/>
+        <w:t xml:space="preserve"/>
+      </w:r>
+      <w:r>
+        <w:rPr>
+          <w:rFonts w:ascii="Calibri" w:cs="Calibri" w:eastAsia="Calibri" w:hAnsi="Calibri"/>
+          <w:color w:val="000000"/>
+          <w:sz w:val="24"/>
+          <w:szCs w:val="24"/>
+        </w:rPr>
+        <w:t xml:space="preserve">La ley ya exige los registros.</w:t>
+      </w:r>
+      <w:r>
+        <w:br/>
+        <w:t xml:space="preserve"/>
+      </w:r>
+      <w:r>
+        <w:rPr>
+          <w:rFonts w:ascii="Calibri" w:cs="Calibri" w:eastAsia="Calibri" w:hAnsi="Calibri"/>
+          <w:color w:val="000000"/>
+          <w:sz w:val="24"/>
+          <w:szCs w:val="24"/>
+        </w:rPr>
+        <w:t xml:space="preserve">Los competidores no los generan.</w:t>
+      </w:r>
+      <w:r>
+        <w:br/>
+        <w:t xml:space="preserve"/>
+      </w:r>
+      <w:r>
+        <w:rPr>
+          <w:rFonts w:ascii="Calibri" w:cs="Calibri" w:eastAsia="Calibri" w:hAnsi="Calibri"/>
+          <w:color w:val="000000"/>
+          <w:sz w:val="24"/>
+          <w:szCs w:val="24"/>
+        </w:rPr>
+        <w:t xml:space="preserve">El primero que llegue con trazabilidad operativa real</w:t>
+      </w:r>
+      <w:r>
+        <w:br/>
+        <w:t xml:space="preserve"/>
+      </w:r>
+      <w:r>
+        <w:rPr>
+          <w:rFonts w:ascii="Calibri" w:cs="Calibri" w:eastAsia="Calibri" w:hAnsi="Calibri"/>
+          <w:color w:val="000000"/>
+          <w:sz w:val="24"/>
+          <w:szCs w:val="24"/>
+        </w:rPr>
+        <w:t xml:space="preserve">se convierte en el estándar del sector.</w:t>
       </w:r>
       <w:r>
         <w:br/>

</xml_diff>

<commit_message>
E3: fallo operativo — narrativa reordenada y ejemplo ilustrativo
"como ejemplo, en una residencia con 50 adultos mayores se realizan
cerca de 450 rondas por semana" — posicionado como referencia
concreta, no estadística universal. Flujo: impacto → escala → consecuencia.

Co-Authored-By: Claude Sonnet 4.6 <noreply@anthropic.com>
</commit_message>
<xml_diff>
--- a/business/CareSignal_Pitch_Guion_4min.docx
+++ b/business/CareSignal_Pitch_Guion_4min.docx
@@ -1471,72 +1471,97 @@
           <w:sz w:val="24"/>
           <w:szCs w:val="24"/>
         </w:rPr>
-        <w:t xml:space="preserve">a las 3 de la mañana — o si la ronda simplemente no ocurrió?</w:t>
-      </w:r>
-      <w:r>
-        <w:br/>
-        <w:t xml:space="preserve"/>
-      </w:r>
-      <w:r>
-        <w:rPr>
-          <w:rFonts w:ascii="Calibri" w:cs="Calibri" w:eastAsia="Calibri" w:hAnsi="Calibri"/>
-          <w:color w:val="000000"/>
-          <w:sz w:val="24"/>
-          <w:szCs w:val="24"/>
-        </w:rPr>
-        <w:t xml:space="preserve">Ese es el fallo operativo: el cuidado que debía suceder, no sucedió</w:t>
-      </w:r>
-      <w:r>
-        <w:br/>
-        <w:t xml:space="preserve"/>
-      </w:r>
-      <w:r>
-        <w:rPr>
-          <w:rFonts w:ascii="Calibri" w:cs="Calibri" w:eastAsia="Calibri" w:hAnsi="Calibri"/>
-          <w:color w:val="000000"/>
-          <w:sz w:val="24"/>
-          <w:szCs w:val="24"/>
-        </w:rPr>
-        <w:t xml:space="preserve">— y nadie lo sabe hasta que es tarde.</w:t>
-      </w:r>
-      <w:r>
-        <w:br/>
-        <w:t xml:space="preserve"/>
-      </w:r>
-      <w:r>
-        <w:rPr>
-          <w:rFonts w:ascii="Calibri" w:cs="Calibri" w:eastAsia="Calibri" w:hAnsi="Calibri"/>
-          <w:color w:val="000000"/>
-          <w:sz w:val="24"/>
-          <w:szCs w:val="24"/>
-        </w:rPr>
-        <w:t xml:space="preserve">Una residencia de 50 residentes realiza cerca de 450 rondas por semana.</w:t>
-      </w:r>
-      <w:r>
-        <w:br/>
-        <w:t xml:space="preserve"/>
-      </w:r>
-      <w:r>
-        <w:rPr>
-          <w:rFonts w:ascii="Calibri" w:cs="Calibri" w:eastAsia="Calibri" w:hAnsi="Calibri"/>
-          <w:color w:val="000000"/>
-          <w:sz w:val="24"/>
-          <w:szCs w:val="24"/>
-        </w:rPr>
-        <w:t xml:space="preserve">Sin un sistema, no hay forma de saber cuántas ocurrieron,</w:t>
-      </w:r>
-      <w:r>
-        <w:br/>
-        <w:t xml:space="preserve"/>
-      </w:r>
-      <w:r>
-        <w:rPr>
-          <w:rFonts w:ascii="Calibri" w:cs="Calibri" w:eastAsia="Calibri" w:hAnsi="Calibri"/>
-          <w:color w:val="000000"/>
-          <w:sz w:val="24"/>
-          <w:szCs w:val="24"/>
-        </w:rPr>
-        <w:t xml:space="preserve">cuántas se retrasaron, ni quién fue responsable.</w:t>
+        <w:t xml:space="preserve">a las 3 de la mañana — o si la ronda simplemente no ocurrió,</w:t>
+      </w:r>
+      <w:r>
+        <w:br/>
+        <w:t xml:space="preserve"/>
+      </w:r>
+      <w:r>
+        <w:rPr>
+          <w:rFonts w:ascii="Calibri" w:cs="Calibri" w:eastAsia="Calibri" w:hAnsi="Calibri"/>
+          <w:color w:val="000000"/>
+          <w:sz w:val="24"/>
+          <w:szCs w:val="24"/>
+        </w:rPr>
+        <w:t xml:space="preserve">y nadie lo sabe hasta que es tarde?</w:t>
+      </w:r>
+      <w:r>
+        <w:br/>
+        <w:t xml:space="preserve"/>
+      </w:r>
+      <w:r>
+        <w:rPr>
+          <w:rFonts w:ascii="Calibri" w:cs="Calibri" w:eastAsia="Calibri" w:hAnsi="Calibri"/>
+          <w:sz w:val="24"/>
+          <w:szCs w:val="24"/>
+        </w:rPr>
+        <w:t xml:space="preserve"> </w:t>
+      </w:r>
+      <w:r>
+        <w:br/>
+        <w:t xml:space="preserve"/>
+      </w:r>
+      <w:r>
+        <w:rPr>
+          <w:rFonts w:ascii="Calibri" w:cs="Calibri" w:eastAsia="Calibri" w:hAnsi="Calibri"/>
+          <w:color w:val="000000"/>
+          <w:sz w:val="24"/>
+          <w:szCs w:val="24"/>
+        </w:rPr>
+        <w:t xml:space="preserve">Ese es el fallo operativo. Y no es un evento aislado —</w:t>
+      </w:r>
+      <w:r>
+        <w:br/>
+        <w:t xml:space="preserve"/>
+      </w:r>
+      <w:r>
+        <w:rPr>
+          <w:rFonts w:ascii="Calibri" w:cs="Calibri" w:eastAsia="Calibri" w:hAnsi="Calibri"/>
+          <w:color w:val="000000"/>
+          <w:sz w:val="24"/>
+          <w:szCs w:val="24"/>
+        </w:rPr>
+        <w:t xml:space="preserve">como ejemplo, en una residencia con 50 adultos mayores</w:t>
+      </w:r>
+      <w:r>
+        <w:br/>
+        <w:t xml:space="preserve"/>
+      </w:r>
+      <w:r>
+        <w:rPr>
+          <w:rFonts w:ascii="Calibri" w:cs="Calibri" w:eastAsia="Calibri" w:hAnsi="Calibri"/>
+          <w:color w:val="000000"/>
+          <w:sz w:val="24"/>
+          <w:szCs w:val="24"/>
+        </w:rPr>
+        <w:t xml:space="preserve">se realizan cerca de 450 rondas por semana.</w:t>
+      </w:r>
+      <w:r>
+        <w:br/>
+        <w:t xml:space="preserve"/>
+      </w:r>
+      <w:r>
+        <w:rPr>
+          <w:rFonts w:ascii="Calibri" w:cs="Calibri" w:eastAsia="Calibri" w:hAnsi="Calibri"/>
+          <w:color w:val="000000"/>
+          <w:sz w:val="24"/>
+          <w:szCs w:val="24"/>
+        </w:rPr>
+        <w:t xml:space="preserve">Cada una es una oportunidad de que el cuidado ocurra,</w:t>
+      </w:r>
+      <w:r>
+        <w:br/>
+        <w:t xml:space="preserve"/>
+      </w:r>
+      <w:r>
+        <w:rPr>
+          <w:rFonts w:ascii="Calibri" w:cs="Calibri" w:eastAsia="Calibri" w:hAnsi="Calibri"/>
+          <w:color w:val="000000"/>
+          <w:sz w:val="24"/>
+          <w:szCs w:val="24"/>
+        </w:rPr>
+        <w:t xml:space="preserve">o de que no ocurra y nadie lo detecte.</w:t>
       </w:r>
       <w:r>
         <w:br/>

</xml_diff>

<commit_message>
E3: fallo administrativo — tres golpes narrativos en lugar de enumeración
"La familia llama y no hay respuesta. La inspección llega y no hay
evidencia. El abogado pregunta y no hay defensa." Cada consecuencia
con su propio peso. Cierre: "en ningún escenario".

Co-Authored-By: Claude Sonnet 4.6 <noreply@anthropic.com>
</commit_message>
<xml_diff>
--- a/business/CareSignal_Pitch_Guion_4min.docx
+++ b/business/CareSignal_Pitch_Guion_4min.docx
@@ -1621,24 +1621,88 @@
       <w:r>
         <w:rPr>
           <w:rFonts w:ascii="Calibri" w:cs="Calibri" w:eastAsia="Calibri" w:hAnsi="Calibri"/>
-          <w:color w:val="000000"/>
-          <w:sz w:val="24"/>
-          <w:szCs w:val="24"/>
-        </w:rPr>
-        <w:t xml:space="preserve">Ese es el fallo administrativo: sin registro auditable, el director no puede</w:t>
-      </w:r>
-      <w:r>
-        <w:br/>
-        <w:t xml:space="preserve"/>
-      </w:r>
-      <w:r>
-        <w:rPr>
-          <w:rFonts w:ascii="Calibri" w:cs="Calibri" w:eastAsia="Calibri" w:hAnsi="Calibri"/>
-          <w:color w:val="000000"/>
-          <w:sz w:val="24"/>
-          <w:szCs w:val="24"/>
-        </w:rPr>
-        <w:t xml:space="preserve">demostrar qué ocurrió — ni ante la familia, ni ante una inspección, ni ante un juez.</w:t>
+          <w:sz w:val="24"/>
+          <w:szCs w:val="24"/>
+        </w:rPr>
+        <w:t xml:space="preserve"> </w:t>
+      </w:r>
+      <w:r>
+        <w:br/>
+        <w:t xml:space="preserve"/>
+      </w:r>
+      <w:r>
+        <w:rPr>
+          <w:rFonts w:ascii="Calibri" w:cs="Calibri" w:eastAsia="Calibri" w:hAnsi="Calibri"/>
+          <w:color w:val="000000"/>
+          <w:sz w:val="24"/>
+          <w:szCs w:val="24"/>
+        </w:rPr>
+        <w:t xml:space="preserve">Ese es el fallo administrativo.</w:t>
+      </w:r>
+      <w:r>
+        <w:br/>
+        <w:t xml:space="preserve"/>
+      </w:r>
+      <w:r>
+        <w:rPr>
+          <w:rFonts w:ascii="Calibri" w:cs="Calibri" w:eastAsia="Calibri" w:hAnsi="Calibri"/>
+          <w:color w:val="000000"/>
+          <w:sz w:val="24"/>
+          <w:szCs w:val="24"/>
+        </w:rPr>
+        <w:t xml:space="preserve">La familia llama y no hay respuesta.</w:t>
+      </w:r>
+      <w:r>
+        <w:br/>
+        <w:t xml:space="preserve"/>
+      </w:r>
+      <w:r>
+        <w:rPr>
+          <w:rFonts w:ascii="Calibri" w:cs="Calibri" w:eastAsia="Calibri" w:hAnsi="Calibri"/>
+          <w:color w:val="000000"/>
+          <w:sz w:val="24"/>
+          <w:szCs w:val="24"/>
+        </w:rPr>
+        <w:t xml:space="preserve">La inspección llega y no hay evidencia.</w:t>
+      </w:r>
+      <w:r>
+        <w:br/>
+        <w:t xml:space="preserve"/>
+      </w:r>
+      <w:r>
+        <w:rPr>
+          <w:rFonts w:ascii="Calibri" w:cs="Calibri" w:eastAsia="Calibri" w:hAnsi="Calibri"/>
+          <w:color w:val="000000"/>
+          <w:sz w:val="24"/>
+          <w:szCs w:val="24"/>
+        </w:rPr>
+        <w:t xml:space="preserve">El abogado pregunta y no hay defensa.</w:t>
+      </w:r>
+      <w:r>
+        <w:br/>
+        <w:t xml:space="preserve"/>
+      </w:r>
+      <w:r>
+        <w:rPr>
+          <w:rFonts w:ascii="Calibri" w:cs="Calibri" w:eastAsia="Calibri" w:hAnsi="Calibri"/>
+          <w:color w:val="000000"/>
+          <w:sz w:val="24"/>
+          <w:szCs w:val="24"/>
+        </w:rPr>
+        <w:t xml:space="preserve">Sin registro auditable, el director no puede demostrar que el cuidado ocurrió</w:t>
+      </w:r>
+      <w:r>
+        <w:br/>
+        <w:t xml:space="preserve"/>
+      </w:r>
+      <w:r>
+        <w:rPr>
+          <w:rFonts w:ascii="Calibri" w:cs="Calibri" w:eastAsia="Calibri" w:hAnsi="Calibri"/>
+          <w:color w:val="000000"/>
+          <w:sz w:val="24"/>
+          <w:szCs w:val="24"/>
+        </w:rPr>
+        <w:t xml:space="preserve">— en ningún escenario.</w:t>
       </w:r>
       <w:r>
         <w:br/>

</xml_diff>

<commit_message>
E3: guion pitch — mercado B2C, precios freemium y margen actualizados
- Bloque 3 · Mercado: agrega línea B2C (~2M familias MX) y corrige
  MRR Profesional a $199k–$798k MXN/mes (precio $3,990)
- Bloque 5 · Modelo: "Freemium + tres planes desde $1,990 hasta $8,490"
  reemplaza "tres planes desde $1,490 hasta $6,990"
- Margen bruto: 97% → 80% (ajuste coherente con nuevo modelo freemium)

Co-Authored-By: Claude Sonnet 4.6 <noreply@anthropic.com>
</commit_message>
<xml_diff>
--- a/business/CareSignal_Pitch_Guion_4min.docx
+++ b/business/CareSignal_Pitch_Guion_4min.docx
@@ -2203,6 +2203,19 @@
           <w:sz w:val="24"/>
           <w:szCs w:val="24"/>
         </w:rPr>
+        <w:t xml:space="preserve">Y dos millones de familias mexicanas coordinan el cuidado de un adulto mayor — ese es nuestro segundo mercado.</w:t>
+      </w:r>
+      <w:r>
+        <w:br/>
+        <w:t xml:space="preserve"/>
+      </w:r>
+      <w:r>
+        <w:rPr>
+          <w:rFonts w:ascii="Calibri" w:cs="Calibri" w:eastAsia="Calibri" w:hAnsi="Calibri"/>
+          <w:color w:val="000000"/>
+          <w:sz w:val="24"/>
+          <w:szCs w:val="24"/>
+        </w:rPr>
         <w:t xml:space="preserve">Nuestro objetivo en 3 años: 50 a 200 residencias.</w:t>
       </w:r>
       <w:r>
@@ -2216,7 +2229,7 @@
           <w:sz w:val="24"/>
           <w:szCs w:val="24"/>
         </w:rPr>
-        <w:t xml:space="preserve">A precio Profesional, entre 175,000 y 700,000 pesos mensuales recurrentes."</w:t>
+        <w:t xml:space="preserve">A precio Profesional, entre 199,000 y 798,000 pesos mensuales recurrentes."</w:t>
       </w:r>
     </w:p>
     <w:p>
@@ -2449,20 +2462,20 @@
           <w:sz w:val="24"/>
           <w:szCs w:val="24"/>
         </w:rPr>
-        <w:t xml:space="preserve">Tres planes desde 1,490 hasta 6,990 pesos por residencia al mes.</w:t>
-      </w:r>
-      <w:r>
-        <w:br/>
-        <w:t xml:space="preserve"/>
-      </w:r>
-      <w:r>
-        <w:rPr>
-          <w:rFonts w:ascii="Calibri" w:cs="Calibri" w:eastAsia="Calibri" w:hAnsi="Calibri"/>
-          <w:color w:val="000000"/>
-          <w:sz w:val="24"/>
-          <w:szCs w:val="24"/>
-        </w:rPr>
-        <w:t xml:space="preserve">Margen bruto superior al 97%."</w:t>
+        <w:t xml:space="preserve">Freemium gratuito para capturar el mercado, más tres planes pagos desde 1,990 hasta 8,490 pesos al mes.</w:t>
+      </w:r>
+      <w:r>
+        <w:br/>
+        <w:t xml:space="preserve"/>
+      </w:r>
+      <w:r>
+        <w:rPr>
+          <w:rFonts w:ascii="Calibri" w:cs="Calibri" w:eastAsia="Calibri" w:hAnsi="Calibri"/>
+          <w:color w:val="000000"/>
+          <w:sz w:val="24"/>
+          <w:szCs w:val="24"/>
+        </w:rPr>
+        <w:t xml:space="preserve">Margen bruto superior al 80%."</w:t>
       </w:r>
     </w:p>
     <w:p>

</xml_diff>

<commit_message>
E3: guion — escena demo 45 s con secuencia de 6 pasos y tiempos reajustados a 4:00
</commit_message>
<xml_diff>
--- a/business/CareSignal_Pitch_Guion_4min.docx
+++ b/business/CareSignal_Pitch_Guion_4min.docx
@@ -488,7 +488,7 @@
                 <w:sz w:val="18"/>
                 <w:szCs w:val="18"/>
               </w:rPr>
-              <w:t xml:space="preserve">45 s</w:t>
+              <w:t xml:space="preserve">30 s</w:t>
             </w:r>
           </w:p>
         </w:tc>
@@ -515,7 +515,7 @@
                 <w:sz w:val="18"/>
                 <w:szCs w:val="18"/>
               </w:rPr>
-              <w:t xml:space="preserve">1:40</w:t>
+              <w:t xml:space="preserve">1:25</w:t>
             </w:r>
           </w:p>
         </w:tc>
@@ -544,7 +544,7 @@
                 <w:sz w:val="18"/>
                 <w:szCs w:val="18"/>
               </w:rPr>
-              <w:t xml:space="preserve">3</w:t>
+              <w:t xml:space="preserve">DEMO</w:t>
             </w:r>
           </w:p>
         </w:tc>
@@ -571,7 +571,7 @@
                 <w:sz w:val="18"/>
                 <w:szCs w:val="18"/>
               </w:rPr>
-              <w:t xml:space="preserve">Mercado</w:t>
+              <w:t xml:space="preserve">🖥  Escena demo en vivo</w:t>
             </w:r>
           </w:p>
         </w:tc>
@@ -598,7 +598,7 @@
                 <w:sz w:val="18"/>
                 <w:szCs w:val="18"/>
               </w:rPr>
-              <w:t xml:space="preserve">35 s</w:t>
+              <w:t xml:space="preserve">45 s</w:t>
             </w:r>
           </w:p>
         </w:tc>
@@ -625,7 +625,7 @@
                 <w:sz w:val="18"/>
                 <w:szCs w:val="18"/>
               </w:rPr>
-              <w:t xml:space="preserve">2:15</w:t>
+              <w:t xml:space="preserve">2:10</w:t>
             </w:r>
           </w:p>
         </w:tc>
@@ -654,7 +654,7 @@
                 <w:sz w:val="18"/>
                 <w:szCs w:val="18"/>
               </w:rPr>
-              <w:t xml:space="preserve">4</w:t>
+              <w:t xml:space="preserve">3</w:t>
             </w:r>
           </w:p>
         </w:tc>
@@ -681,7 +681,7 @@
                 <w:sz w:val="18"/>
                 <w:szCs w:val="18"/>
               </w:rPr>
-              <w:t xml:space="preserve">Diferenciador</w:t>
+              <w:t xml:space="preserve">Mercado</w:t>
             </w:r>
           </w:p>
         </w:tc>
@@ -735,7 +735,7 @@
                 <w:sz w:val="18"/>
                 <w:szCs w:val="18"/>
               </w:rPr>
-              <w:t xml:space="preserve">2:40</w:t>
+              <w:t xml:space="preserve">2:35</w:t>
             </w:r>
           </w:p>
         </w:tc>
@@ -764,7 +764,7 @@
                 <w:sz w:val="18"/>
                 <w:szCs w:val="18"/>
               </w:rPr>
-              <w:t xml:space="preserve">5</w:t>
+              <w:t xml:space="preserve">4</w:t>
             </w:r>
           </w:p>
         </w:tc>
@@ -791,7 +791,7 @@
                 <w:sz w:val="18"/>
                 <w:szCs w:val="18"/>
               </w:rPr>
-              <w:t xml:space="preserve">Tracción / Prueba</w:t>
+              <w:t xml:space="preserve">Diferenciador</w:t>
             </w:r>
           </w:p>
         </w:tc>
@@ -818,7 +818,7 @@
                 <w:sz w:val="18"/>
                 <w:szCs w:val="18"/>
               </w:rPr>
-              <w:t xml:space="preserve">25 s</w:t>
+              <w:t xml:space="preserve">20 s</w:t>
             </w:r>
           </w:p>
         </w:tc>
@@ -845,7 +845,7 @@
                 <w:sz w:val="18"/>
                 <w:szCs w:val="18"/>
               </w:rPr>
-              <w:t xml:space="preserve">3:05</w:t>
+              <w:t xml:space="preserve">2:55</w:t>
             </w:r>
           </w:p>
         </w:tc>
@@ -874,7 +874,7 @@
                 <w:sz w:val="18"/>
                 <w:szCs w:val="18"/>
               </w:rPr>
-              <w:t xml:space="preserve">6</w:t>
+              <w:t xml:space="preserve">5</w:t>
             </w:r>
           </w:p>
         </w:tc>
@@ -901,7 +901,7 @@
                 <w:sz w:val="18"/>
                 <w:szCs w:val="18"/>
               </w:rPr>
-              <w:t xml:space="preserve">Modelo de negocio</w:t>
+              <w:t xml:space="preserve">Tracción + Modelo</w:t>
             </w:r>
           </w:p>
         </w:tc>
@@ -928,7 +928,7 @@
                 <w:sz w:val="18"/>
                 <w:szCs w:val="18"/>
               </w:rPr>
-              <w:t xml:space="preserve">20 s</w:t>
+              <w:t xml:space="preserve">25 s</w:t>
             </w:r>
           </w:p>
         </w:tc>
@@ -955,7 +955,7 @@
                 <w:sz w:val="18"/>
                 <w:szCs w:val="18"/>
               </w:rPr>
-              <w:t xml:space="preserve">3:25</w:t>
+              <w:t xml:space="preserve">3:20</w:t>
             </w:r>
           </w:p>
         </w:tc>
@@ -984,7 +984,7 @@
                 <w:sz w:val="18"/>
                 <w:szCs w:val="18"/>
               </w:rPr>
-              <w:t xml:space="preserve">7</w:t>
+              <w:t xml:space="preserve">6</w:t>
             </w:r>
           </w:p>
         </w:tc>
@@ -1038,7 +1038,7 @@
                 <w:sz w:val="18"/>
                 <w:szCs w:val="18"/>
               </w:rPr>
-              <w:t xml:space="preserve">25 s</w:t>
+              <w:t xml:space="preserve">20 s</w:t>
             </w:r>
           </w:p>
         </w:tc>
@@ -1065,7 +1065,7 @@
                 <w:sz w:val="18"/>
                 <w:szCs w:val="18"/>
               </w:rPr>
-              <w:t xml:space="preserve">3:50</w:t>
+              <w:t xml:space="preserve">3:40</w:t>
             </w:r>
           </w:p>
         </w:tc>
@@ -1094,7 +1094,7 @@
                 <w:sz w:val="18"/>
                 <w:szCs w:val="18"/>
               </w:rPr>
-              <w:t xml:space="preserve">8</w:t>
+              <w:t xml:space="preserve">7</w:t>
             </w:r>
           </w:p>
         </w:tc>
@@ -1175,7 +1175,7 @@
                 <w:sz w:val="18"/>
                 <w:szCs w:val="18"/>
               </w:rPr>
-              <w:t xml:space="preserve">4:10</w:t>
+              <w:t xml:space="preserve">4:00</w:t>
             </w:r>
           </w:p>
         </w:tc>
@@ -1195,7 +1195,7 @@
           <w:sz w:val="20"/>
           <w:szCs w:val="20"/>
         </w:rPr>
-        <w:t xml:space="preserve">Total: ~4:10 · margen aceptable. Si hay límite estricto de 4:00, recorta una oración del bloque 3 (mercado).</w:t>
+        <w:t xml:space="preserve">Total: 4:00 exactos. Si el juez interrumpe antes del bloque 6, salta directo al bloque 7 (Cierre).</w:t>
       </w:r>
     </w:p>
     <w:p>
@@ -2007,7 +2007,7 @@
           <w:sz w:val="20"/>
           <w:szCs w:val="20"/>
         </w:rPr>
-        <w:t xml:space="preserve">   ·   30 s   ·   Acumulado: 2:05</w:t>
+        <w:t xml:space="preserve">   ·   30 s   ·   Acumulado: 1:25</w:t>
       </w:r>
     </w:p>
     <w:p>
@@ -2106,7 +2106,20 @@
           <w:sz w:val="24"/>
           <w:szCs w:val="24"/>
         </w:rPr>
-        <w:t xml:space="preserve">El director tiene evidencia lista ante cualquier inspección, queja o demanda."</w:t>
+        <w:t xml:space="preserve">El director tiene evidencia lista ante cualquier inspección, queja o demanda.</w:t>
+      </w:r>
+      <w:r>
+        <w:br/>
+        <w:t xml:space="preserve"/>
+      </w:r>
+      <w:r>
+        <w:rPr>
+          <w:rFonts w:ascii="Calibri" w:cs="Calibri" w:eastAsia="Calibri" w:hAnsi="Calibri"/>
+          <w:color w:val="000000"/>
+          <w:sz w:val="24"/>
+          <w:szCs w:val="24"/>
+        </w:rPr>
+        <w:t xml:space="preserve">Y se los voy a mostrar en vivo."</w:t>
       </w:r>
     </w:p>
     <w:p>
@@ -2131,7 +2144,7 @@
           <w:sz w:val="28"/>
           <w:szCs w:val="28"/>
         </w:rPr>
-        <w:t xml:space="preserve">Bloque 3 · Mercado</w:t>
+        <w:t xml:space="preserve">DEMO · Escena en vivo — 45 segundos</w:t>
       </w:r>
     </w:p>
     <w:p>
@@ -2147,7 +2160,7 @@
           <w:sz w:val="20"/>
           <w:szCs w:val="20"/>
         </w:rPr>
-        <w:t xml:space="preserve">Objetivo: SAM y potencial de ingresos en 25 segundos.</w:t>
+        <w:t xml:space="preserve">Objetivo: el juez ve la alerta nacer y cerrarse ante sus ojos.</w:t>
       </w:r>
       <w:r>
         <w:rPr>
@@ -2156,7 +2169,7 @@
           <w:sz w:val="20"/>
           <w:szCs w:val="20"/>
         </w:rPr>
-        <w:t xml:space="preserve">   ·   25 s   ·   Acumulado: 2:30</w:t>
+        <w:t xml:space="preserve">   ·   45 s   ·   Acumulado: 2:10</w:t>
       </w:r>
     </w:p>
     <w:p>
@@ -2172,7 +2185,938 @@
           <w:sz w:val="20"/>
           <w:szCs w:val="20"/>
         </w:rPr>
-        <w:t xml:space="preserve">⏱ El tamaño global ya se dijo en el bloque 1 — aquí solo el mercado accionable.</w:t>
+        <w:t xml:space="preserve">⏱ Pantalla compartida. Abre la app ANTES de subir al frente. Practica hasta que cada clic sea automático.</w:t>
+      </w:r>
+    </w:p>
+    <w:p/>
+    <w:p>
+      <w:pPr>
+        <w:spacing w:after="60"/>
+      </w:pPr>
+      <w:r>
+        <w:rPr>
+          <w:rFonts w:ascii="Calibri" w:cs="Calibri" w:eastAsia="Calibri" w:hAnsi="Calibri"/>
+          <w:b/>
+          <w:bCs/>
+          <w:color w:val="1A5276"/>
+          <w:sz w:val="22"/>
+          <w:szCs w:val="22"/>
+        </w:rPr>
+        <w:t xml:space="preserve">Setup antes de presentar:</w:t>
+      </w:r>
+    </w:p>
+    <w:p>
+      <w:pPr>
+        <w:spacing w:after="40"/>
+      </w:pPr>
+      <w:r>
+        <w:rPr>
+          <w:rFonts w:ascii="Calibri" w:cs="Calibri" w:eastAsia="Calibri" w:hAnsi="Calibri"/>
+          <w:color w:val="000000"/>
+          <w:sz w:val="24"/>
+          <w:szCs w:val="24"/>
+        </w:rPr>
+        <w:t xml:space="preserve">1. App corriendo en localhost:5173 — pestaña fijada, sin otras pestañas.</w:t>
+      </w:r>
+    </w:p>
+    <w:p>
+      <w:pPr>
+        <w:spacing w:after="40"/>
+      </w:pPr>
+      <w:r>
+        <w:rPr>
+          <w:rFonts w:ascii="Calibri" w:cs="Calibri" w:eastAsia="Calibri" w:hAnsi="Calibri"/>
+          <w:color w:val="000000"/>
+          <w:sz w:val="24"/>
+          <w:szCs w:val="24"/>
+        </w:rPr>
+        <w:t xml:space="preserve">2. Reloj simulado pausado en 02:55 — la ronda de Habitación 3 vence a las 03:00.</w:t>
+      </w:r>
+    </w:p>
+    <w:p>
+      <w:pPr>
+        <w:spacing w:after="40"/>
+      </w:pPr>
+      <w:r>
+        <w:rPr>
+          <w:rFonts w:ascii="Calibri" w:cs="Calibri" w:eastAsia="Calibri" w:hAnsi="Calibri"/>
+          <w:color w:val="000000"/>
+          <w:sz w:val="24"/>
+          <w:szCs w:val="24"/>
+        </w:rPr>
+        <w:t xml:space="preserve">3. Resolución mínima: 1280 × 720. Fuente del sistema al 125 %.</w:t>
+      </w:r>
+    </w:p>
+    <w:p>
+      <w:pPr>
+        <w:spacing w:after="120"/>
+      </w:pPr>
+      <w:r>
+        <w:rPr>
+          <w:rFonts w:ascii="Calibri" w:cs="Calibri" w:eastAsia="Calibri" w:hAnsi="Calibri"/>
+          <w:color w:val="000000"/>
+          <w:sz w:val="24"/>
+          <w:szCs w:val="24"/>
+        </w:rPr>
+        <w:t xml:space="preserve">4. Si usas proyector: prueba colores antes — el azul #5B8DB8 puede verse apagado.</w:t>
+      </w:r>
+    </w:p>
+    <w:p>
+      <w:pPr>
+        <w:spacing w:after="80"/>
+      </w:pPr>
+      <w:r>
+        <w:rPr>
+          <w:rFonts w:ascii="Calibri" w:cs="Calibri" w:eastAsia="Calibri" w:hAnsi="Calibri"/>
+          <w:b/>
+          <w:bCs/>
+          <w:color w:val="1A5276"/>
+          <w:sz w:val="22"/>
+          <w:szCs w:val="22"/>
+        </w:rPr>
+        <w:t xml:space="preserve">Secuencia de 6 pasos (45 s):</w:t>
+      </w:r>
+    </w:p>
+    <w:tbl>
+      <w:tblPr>
+        <w:tblW w:type="dxa" w:w="9000"/>
+        <w:tblBorders>
+          <w:top w:val="single" w:color="auto" w:sz="4"/>
+          <w:left w:val="single" w:color="auto" w:sz="4"/>
+          <w:bottom w:val="single" w:color="auto" w:sz="4"/>
+          <w:right w:val="single" w:color="auto" w:sz="4"/>
+          <w:insideH w:val="single" w:color="auto" w:sz="4"/>
+          <w:insideV w:val="single" w:color="auto" w:sz="4"/>
+        </w:tblBorders>
+      </w:tblPr>
+      <w:tblGrid>
+        <w:gridCol w:w="100"/>
+        <w:gridCol w:w="100"/>
+        <w:gridCol w:w="100"/>
+        <w:gridCol w:w="100"/>
+      </w:tblGrid>
+      <w:tr>
+        <w:trPr>
+          <w:tblHeader/>
+        </w:trPr>
+        <w:tc>
+          <w:tcPr>
+            <w:shd w:fill="1A5276" w:val="clear"/>
+            <w:tcMar>
+              <w:top w:type="dxa" w:w="60"/>
+              <w:left w:type="dxa" w:w="100"/>
+              <w:bottom w:type="dxa" w:w="60"/>
+              <w:right w:type="dxa" w:w="100"/>
+            </w:tcMar>
+          </w:tcPr>
+          <w:p>
+            <w:pPr>
+              <w:spacing w:after="60" w:before="60"/>
+            </w:pPr>
+            <w:r>
+              <w:rPr>
+                <w:rFonts w:ascii="Calibri" w:cs="Calibri" w:eastAsia="Calibri" w:hAnsi="Calibri"/>
+                <w:b/>
+                <w:bCs/>
+                <w:color w:val="FFFFFF"/>
+                <w:sz w:val="18"/>
+                <w:szCs w:val="18"/>
+              </w:rPr>
+              <w:t xml:space="preserve">Paso</w:t>
+            </w:r>
+          </w:p>
+        </w:tc>
+        <w:tc>
+          <w:tcPr>
+            <w:shd w:fill="1A5276" w:val="clear"/>
+            <w:tcMar>
+              <w:top w:type="dxa" w:w="60"/>
+              <w:left w:type="dxa" w:w="100"/>
+              <w:bottom w:type="dxa" w:w="60"/>
+              <w:right w:type="dxa" w:w="100"/>
+            </w:tcMar>
+          </w:tcPr>
+          <w:p>
+            <w:pPr>
+              <w:spacing w:after="60" w:before="60"/>
+            </w:pPr>
+            <w:r>
+              <w:rPr>
+                <w:rFonts w:ascii="Calibri" w:cs="Calibri" w:eastAsia="Calibri" w:hAnsi="Calibri"/>
+                <w:b/>
+                <w:bCs/>
+                <w:color w:val="FFFFFF"/>
+                <w:sz w:val="18"/>
+                <w:szCs w:val="18"/>
+              </w:rPr>
+              <w:t xml:space="preserve">Pantalla / acción</w:t>
+            </w:r>
+          </w:p>
+        </w:tc>
+        <w:tc>
+          <w:tcPr>
+            <w:shd w:fill="1A5276" w:val="clear"/>
+            <w:tcMar>
+              <w:top w:type="dxa" w:w="60"/>
+              <w:left w:type="dxa" w:w="100"/>
+              <w:bottom w:type="dxa" w:w="60"/>
+              <w:right w:type="dxa" w:w="100"/>
+            </w:tcMar>
+          </w:tcPr>
+          <w:p>
+            <w:pPr>
+              <w:spacing w:after="60" w:before="60"/>
+            </w:pPr>
+            <w:r>
+              <w:rPr>
+                <w:rFonts w:ascii="Calibri" w:cs="Calibri" w:eastAsia="Calibri" w:hAnsi="Calibri"/>
+                <w:b/>
+                <w:bCs/>
+                <w:color w:val="FFFFFF"/>
+                <w:sz w:val="18"/>
+                <w:szCs w:val="18"/>
+              </w:rPr>
+              <w:t xml:space="preserve">Narración en voz alta</w:t>
+            </w:r>
+          </w:p>
+        </w:tc>
+        <w:tc>
+          <w:tcPr>
+            <w:shd w:fill="1A5276" w:val="clear"/>
+            <w:tcMar>
+              <w:top w:type="dxa" w:w="60"/>
+              <w:left w:type="dxa" w:w="100"/>
+              <w:bottom w:type="dxa" w:w="60"/>
+              <w:right w:type="dxa" w:w="100"/>
+            </w:tcMar>
+          </w:tcPr>
+          <w:p>
+            <w:pPr>
+              <w:spacing w:after="60" w:before="60"/>
+            </w:pPr>
+            <w:r>
+              <w:rPr>
+                <w:rFonts w:ascii="Calibri" w:cs="Calibri" w:eastAsia="Calibri" w:hAnsi="Calibri"/>
+                <w:b/>
+                <w:bCs/>
+                <w:color w:val="FFFFFF"/>
+                <w:sz w:val="18"/>
+                <w:szCs w:val="18"/>
+              </w:rPr>
+              <w:t xml:space="preserve">Seg</w:t>
+            </w:r>
+          </w:p>
+        </w:tc>
+      </w:tr>
+      <w:tr>
+        <w:tc>
+          <w:tcPr>
+            <w:shd w:fill="FFFFFF" w:val="clear"/>
+            <w:tcMar>
+              <w:top w:type="dxa" w:w="60"/>
+              <w:left w:type="dxa" w:w="100"/>
+              <w:bottom w:type="dxa" w:w="60"/>
+              <w:right w:type="dxa" w:w="100"/>
+            </w:tcMar>
+          </w:tcPr>
+          <w:p>
+            <w:pPr>
+              <w:spacing w:after="60" w:before="60"/>
+            </w:pPr>
+            <w:r>
+              <w:rPr>
+                <w:rFonts w:ascii="Calibri" w:cs="Calibri" w:eastAsia="Calibri" w:hAnsi="Calibri"/>
+                <w:b w:val="false"/>
+                <w:bCs w:val="false"/>
+                <w:color w:val="000000"/>
+                <w:sz w:val="18"/>
+                <w:szCs w:val="18"/>
+              </w:rPr>
+              <w:t xml:space="preserve">1</w:t>
+            </w:r>
+          </w:p>
+        </w:tc>
+        <w:tc>
+          <w:tcPr>
+            <w:shd w:fill="FFFFFF" w:val="clear"/>
+            <w:tcMar>
+              <w:top w:type="dxa" w:w="60"/>
+              <w:left w:type="dxa" w:w="100"/>
+              <w:bottom w:type="dxa" w:w="60"/>
+              <w:right w:type="dxa" w:w="100"/>
+            </w:tcMar>
+          </w:tcPr>
+          <w:p>
+            <w:pPr>
+              <w:spacing w:after="60" w:before="60"/>
+            </w:pPr>
+            <w:r>
+              <w:rPr>
+                <w:rFonts w:ascii="Calibri" w:cs="Calibri" w:eastAsia="Calibri" w:hAnsi="Calibri"/>
+                <w:b w:val="false"/>
+                <w:bCs w:val="false"/>
+                <w:color w:val="000000"/>
+                <w:sz w:val="18"/>
+                <w:szCs w:val="18"/>
+              </w:rPr>
+              <w:t xml:space="preserve">Dashboard — lista de rondas activas, Habitación 3 en estado "Programada"</w:t>
+            </w:r>
+          </w:p>
+        </w:tc>
+        <w:tc>
+          <w:tcPr>
+            <w:shd w:fill="FFFFFF" w:val="clear"/>
+            <w:tcMar>
+              <w:top w:type="dxa" w:w="60"/>
+              <w:left w:type="dxa" w:w="100"/>
+              <w:bottom w:type="dxa" w:w="60"/>
+              <w:right w:type="dxa" w:w="100"/>
+            </w:tcMar>
+          </w:tcPr>
+          <w:p>
+            <w:pPr>
+              <w:spacing w:after="60" w:before="60"/>
+            </w:pPr>
+            <w:r>
+              <w:rPr>
+                <w:rFonts w:ascii="Calibri" w:cs="Calibri" w:eastAsia="Calibri" w:hAnsi="Calibri"/>
+                <w:b w:val="false"/>
+                <w:bCs w:val="false"/>
+                <w:color w:val="000000"/>
+                <w:sz w:val="18"/>
+                <w:szCs w:val="18"/>
+              </w:rPr>
+              <w:t xml:space="preserve">"Este es el turno de noche. Son casi las 3 AM. La ronda de Habitación 3 está pendiente."</w:t>
+            </w:r>
+          </w:p>
+        </w:tc>
+        <w:tc>
+          <w:tcPr>
+            <w:shd w:fill="FFFFFF" w:val="clear"/>
+            <w:tcMar>
+              <w:top w:type="dxa" w:w="60"/>
+              <w:left w:type="dxa" w:w="100"/>
+              <w:bottom w:type="dxa" w:w="60"/>
+              <w:right w:type="dxa" w:w="100"/>
+            </w:tcMar>
+          </w:tcPr>
+          <w:p>
+            <w:pPr>
+              <w:spacing w:after="60" w:before="60"/>
+            </w:pPr>
+            <w:r>
+              <w:rPr>
+                <w:rFonts w:ascii="Calibri" w:cs="Calibri" w:eastAsia="Calibri" w:hAnsi="Calibri"/>
+                <w:b w:val="false"/>
+                <w:bCs w:val="false"/>
+                <w:color w:val="000000"/>
+                <w:sz w:val="18"/>
+                <w:szCs w:val="18"/>
+              </w:rPr>
+              <w:t xml:space="preserve">8 s</w:t>
+            </w:r>
+          </w:p>
+        </w:tc>
+      </w:tr>
+      <w:tr>
+        <w:tc>
+          <w:tcPr>
+            <w:shd w:fill="D6EAF8" w:val="clear"/>
+            <w:tcMar>
+              <w:top w:type="dxa" w:w="60"/>
+              <w:left w:type="dxa" w:w="100"/>
+              <w:bottom w:type="dxa" w:w="60"/>
+              <w:right w:type="dxa" w:w="100"/>
+            </w:tcMar>
+          </w:tcPr>
+          <w:p>
+            <w:pPr>
+              <w:spacing w:after="60" w:before="60"/>
+            </w:pPr>
+            <w:r>
+              <w:rPr>
+                <w:rFonts w:ascii="Calibri" w:cs="Calibri" w:eastAsia="Calibri" w:hAnsi="Calibri"/>
+                <w:b w:val="false"/>
+                <w:bCs w:val="false"/>
+                <w:color w:val="000000"/>
+                <w:sz w:val="18"/>
+                <w:szCs w:val="18"/>
+              </w:rPr>
+              <w:t xml:space="preserve">2</w:t>
+            </w:r>
+          </w:p>
+        </w:tc>
+        <w:tc>
+          <w:tcPr>
+            <w:shd w:fill="D6EAF8" w:val="clear"/>
+            <w:tcMar>
+              <w:top w:type="dxa" w:w="60"/>
+              <w:left w:type="dxa" w:w="100"/>
+              <w:bottom w:type="dxa" w:w="60"/>
+              <w:right w:type="dxa" w:w="100"/>
+            </w:tcMar>
+          </w:tcPr>
+          <w:p>
+            <w:pPr>
+              <w:spacing w:after="60" w:before="60"/>
+            </w:pPr>
+            <w:r>
+              <w:rPr>
+                <w:rFonts w:ascii="Calibri" w:cs="Calibri" w:eastAsia="Calibri" w:hAnsi="Calibri"/>
+                <w:b w:val="false"/>
+                <w:bCs w:val="false"/>
+                <w:color w:val="000000"/>
+                <w:sz w:val="18"/>
+                <w:szCs w:val="18"/>
+              </w:rPr>
+              <w:t xml:space="preserve">Clic en el botón "▶ Avanzar reloj" — reloj salta a 03:05</w:t>
+            </w:r>
+          </w:p>
+        </w:tc>
+        <w:tc>
+          <w:tcPr>
+            <w:shd w:fill="D6EAF8" w:val="clear"/>
+            <w:tcMar>
+              <w:top w:type="dxa" w:w="60"/>
+              <w:left w:type="dxa" w:w="100"/>
+              <w:bottom w:type="dxa" w:w="60"/>
+              <w:right w:type="dxa" w:w="100"/>
+            </w:tcMar>
+          </w:tcPr>
+          <w:p>
+            <w:pPr>
+              <w:spacing w:after="60" w:before="60"/>
+            </w:pPr>
+            <w:r>
+              <w:rPr>
+                <w:rFonts w:ascii="Calibri" w:cs="Calibri" w:eastAsia="Calibri" w:hAnsi="Calibri"/>
+                <w:b w:val="false"/>
+                <w:bCs w:val="false"/>
+                <w:color w:val="000000"/>
+                <w:sz w:val="18"/>
+                <w:szCs w:val="18"/>
+              </w:rPr>
+              <w:t xml:space="preserve">"Pasan cinco minutos. La ronda no ocurrió."</w:t>
+            </w:r>
+          </w:p>
+        </w:tc>
+        <w:tc>
+          <w:tcPr>
+            <w:shd w:fill="D6EAF8" w:val="clear"/>
+            <w:tcMar>
+              <w:top w:type="dxa" w:w="60"/>
+              <w:left w:type="dxa" w:w="100"/>
+              <w:bottom w:type="dxa" w:w="60"/>
+              <w:right w:type="dxa" w:w="100"/>
+            </w:tcMar>
+          </w:tcPr>
+          <w:p>
+            <w:pPr>
+              <w:spacing w:after="60" w:before="60"/>
+            </w:pPr>
+            <w:r>
+              <w:rPr>
+                <w:rFonts w:ascii="Calibri" w:cs="Calibri" w:eastAsia="Calibri" w:hAnsi="Calibri"/>
+                <w:b w:val="false"/>
+                <w:bCs w:val="false"/>
+                <w:color w:val="000000"/>
+                <w:sz w:val="18"/>
+                <w:szCs w:val="18"/>
+              </w:rPr>
+              <w:t xml:space="preserve">5 s</w:t>
+            </w:r>
+          </w:p>
+        </w:tc>
+      </w:tr>
+      <w:tr>
+        <w:tc>
+          <w:tcPr>
+            <w:shd w:fill="FFFFFF" w:val="clear"/>
+            <w:tcMar>
+              <w:top w:type="dxa" w:w="60"/>
+              <w:left w:type="dxa" w:w="100"/>
+              <w:bottom w:type="dxa" w:w="60"/>
+              <w:right w:type="dxa" w:w="100"/>
+            </w:tcMar>
+          </w:tcPr>
+          <w:p>
+            <w:pPr>
+              <w:spacing w:after="60" w:before="60"/>
+            </w:pPr>
+            <w:r>
+              <w:rPr>
+                <w:rFonts w:ascii="Calibri" w:cs="Calibri" w:eastAsia="Calibri" w:hAnsi="Calibri"/>
+                <w:b w:val="false"/>
+                <w:bCs w:val="false"/>
+                <w:color w:val="000000"/>
+                <w:sz w:val="18"/>
+                <w:szCs w:val="18"/>
+              </w:rPr>
+              <w:t xml:space="preserve">3</w:t>
+            </w:r>
+          </w:p>
+        </w:tc>
+        <w:tc>
+          <w:tcPr>
+            <w:shd w:fill="FFFFFF" w:val="clear"/>
+            <w:tcMar>
+              <w:top w:type="dxa" w:w="60"/>
+              <w:left w:type="dxa" w:w="100"/>
+              <w:bottom w:type="dxa" w:w="60"/>
+              <w:right w:type="dxa" w:w="100"/>
+            </w:tcMar>
+          </w:tcPr>
+          <w:p>
+            <w:pPr>
+              <w:spacing w:after="60" w:before="60"/>
+            </w:pPr>
+            <w:r>
+              <w:rPr>
+                <w:rFonts w:ascii="Calibri" w:cs="Calibri" w:eastAsia="Calibri" w:hAnsi="Calibri"/>
+                <w:b w:val="false"/>
+                <w:bCs w:val="false"/>
+                <w:color w:val="000000"/>
+                <w:sz w:val="18"/>
+                <w:szCs w:val="18"/>
+              </w:rPr>
+              <w:t xml:space="preserve">La fila de Habitación 3 cambia a rojo "VENCIDA" — aparece chip de alerta amarilla en la columna de alertas</w:t>
+            </w:r>
+          </w:p>
+        </w:tc>
+        <w:tc>
+          <w:tcPr>
+            <w:shd w:fill="FFFFFF" w:val="clear"/>
+            <w:tcMar>
+              <w:top w:type="dxa" w:w="60"/>
+              <w:left w:type="dxa" w:w="100"/>
+              <w:bottom w:type="dxa" w:w="60"/>
+              <w:right w:type="dxa" w:w="100"/>
+            </w:tcMar>
+          </w:tcPr>
+          <w:p>
+            <w:pPr>
+              <w:spacing w:after="60" w:before="60"/>
+            </w:pPr>
+            <w:r>
+              <w:rPr>
+                <w:rFonts w:ascii="Calibri" w:cs="Calibri" w:eastAsia="Calibri" w:hAnsi="Calibri"/>
+                <w:b w:val="false"/>
+                <w:bCs w:val="false"/>
+                <w:color w:val="000000"/>
+                <w:sz w:val="18"/>
+                <w:szCs w:val="18"/>
+              </w:rPr>
+              <w:t xml:space="preserve">"CareSignal la detecta solo — sin que nadie llame, sin que nadie revise un cuaderno."</w:t>
+            </w:r>
+          </w:p>
+        </w:tc>
+        <w:tc>
+          <w:tcPr>
+            <w:shd w:fill="FFFFFF" w:val="clear"/>
+            <w:tcMar>
+              <w:top w:type="dxa" w:w="60"/>
+              <w:left w:type="dxa" w:w="100"/>
+              <w:bottom w:type="dxa" w:w="60"/>
+              <w:right w:type="dxa" w:w="100"/>
+            </w:tcMar>
+          </w:tcPr>
+          <w:p>
+            <w:pPr>
+              <w:spacing w:after="60" w:before="60"/>
+            </w:pPr>
+            <w:r>
+              <w:rPr>
+                <w:rFonts w:ascii="Calibri" w:cs="Calibri" w:eastAsia="Calibri" w:hAnsi="Calibri"/>
+                <w:b w:val="false"/>
+                <w:bCs w:val="false"/>
+                <w:color w:val="000000"/>
+                <w:sz w:val="18"/>
+                <w:szCs w:val="18"/>
+              </w:rPr>
+              <w:t xml:space="preserve">8 s</w:t>
+            </w:r>
+          </w:p>
+        </w:tc>
+      </w:tr>
+      <w:tr>
+        <w:tc>
+          <w:tcPr>
+            <w:shd w:fill="D6EAF8" w:val="clear"/>
+            <w:tcMar>
+              <w:top w:type="dxa" w:w="60"/>
+              <w:left w:type="dxa" w:w="100"/>
+              <w:bottom w:type="dxa" w:w="60"/>
+              <w:right w:type="dxa" w:w="100"/>
+            </w:tcMar>
+          </w:tcPr>
+          <w:p>
+            <w:pPr>
+              <w:spacing w:after="60" w:before="60"/>
+            </w:pPr>
+            <w:r>
+              <w:rPr>
+                <w:rFonts w:ascii="Calibri" w:cs="Calibri" w:eastAsia="Calibri" w:hAnsi="Calibri"/>
+                <w:b w:val="false"/>
+                <w:bCs w:val="false"/>
+                <w:color w:val="000000"/>
+                <w:sz w:val="18"/>
+                <w:szCs w:val="18"/>
+              </w:rPr>
+              <w:t xml:space="preserve">4</w:t>
+            </w:r>
+          </w:p>
+        </w:tc>
+        <w:tc>
+          <w:tcPr>
+            <w:shd w:fill="D6EAF8" w:val="clear"/>
+            <w:tcMar>
+              <w:top w:type="dxa" w:w="60"/>
+              <w:left w:type="dxa" w:w="100"/>
+              <w:bottom w:type="dxa" w:w="60"/>
+              <w:right w:type="dxa" w:w="100"/>
+            </w:tcMar>
+          </w:tcPr>
+          <w:p>
+            <w:pPr>
+              <w:spacing w:after="60" w:before="60"/>
+            </w:pPr>
+            <w:r>
+              <w:rPr>
+                <w:rFonts w:ascii="Calibri" w:cs="Calibri" w:eastAsia="Calibri" w:hAnsi="Calibri"/>
+                <w:b w:val="false"/>
+                <w:bCs w:val="false"/>
+                <w:color w:val="000000"/>
+                <w:sz w:val="18"/>
+                <w:szCs w:val="18"/>
+              </w:rPr>
+              <w:t xml:space="preserve">Clic en la alerta → modal de detalle. Clic en "Reconocer" (rol supervisor)</w:t>
+            </w:r>
+          </w:p>
+        </w:tc>
+        <w:tc>
+          <w:tcPr>
+            <w:shd w:fill="D6EAF8" w:val="clear"/>
+            <w:tcMar>
+              <w:top w:type="dxa" w:w="60"/>
+              <w:left w:type="dxa" w:w="100"/>
+              <w:bottom w:type="dxa" w:w="60"/>
+              <w:right w:type="dxa" w:w="100"/>
+            </w:tcMar>
+          </w:tcPr>
+          <w:p>
+            <w:pPr>
+              <w:spacing w:after="60" w:before="60"/>
+            </w:pPr>
+            <w:r>
+              <w:rPr>
+                <w:rFonts w:ascii="Calibri" w:cs="Calibri" w:eastAsia="Calibri" w:hAnsi="Calibri"/>
+                <w:b w:val="false"/>
+                <w:bCs w:val="false"/>
+                <w:color w:val="000000"/>
+                <w:sz w:val="18"/>
+                <w:szCs w:val="18"/>
+              </w:rPr>
+              <w:t xml:space="preserve">"El supervisor la recibe al instante y la reconoce."</w:t>
+            </w:r>
+          </w:p>
+        </w:tc>
+        <w:tc>
+          <w:tcPr>
+            <w:shd w:fill="D6EAF8" w:val="clear"/>
+            <w:tcMar>
+              <w:top w:type="dxa" w:w="60"/>
+              <w:left w:type="dxa" w:w="100"/>
+              <w:bottom w:type="dxa" w:w="60"/>
+              <w:right w:type="dxa" w:w="100"/>
+            </w:tcMar>
+          </w:tcPr>
+          <w:p>
+            <w:pPr>
+              <w:spacing w:after="60" w:before="60"/>
+            </w:pPr>
+            <w:r>
+              <w:rPr>
+                <w:rFonts w:ascii="Calibri" w:cs="Calibri" w:eastAsia="Calibri" w:hAnsi="Calibri"/>
+                <w:b w:val="false"/>
+                <w:bCs w:val="false"/>
+                <w:color w:val="000000"/>
+                <w:sz w:val="18"/>
+                <w:szCs w:val="18"/>
+              </w:rPr>
+              <w:t xml:space="preserve">6 s</w:t>
+            </w:r>
+          </w:p>
+        </w:tc>
+      </w:tr>
+      <w:tr>
+        <w:tc>
+          <w:tcPr>
+            <w:shd w:fill="FFFFFF" w:val="clear"/>
+            <w:tcMar>
+              <w:top w:type="dxa" w:w="60"/>
+              <w:left w:type="dxa" w:w="100"/>
+              <w:bottom w:type="dxa" w:w="60"/>
+              <w:right w:type="dxa" w:w="100"/>
+            </w:tcMar>
+          </w:tcPr>
+          <w:p>
+            <w:pPr>
+              <w:spacing w:after="60" w:before="60"/>
+            </w:pPr>
+            <w:r>
+              <w:rPr>
+                <w:rFonts w:ascii="Calibri" w:cs="Calibri" w:eastAsia="Calibri" w:hAnsi="Calibri"/>
+                <w:b w:val="false"/>
+                <w:bCs w:val="false"/>
+                <w:color w:val="000000"/>
+                <w:sz w:val="18"/>
+                <w:szCs w:val="18"/>
+              </w:rPr>
+              <w:t xml:space="preserve">5</w:t>
+            </w:r>
+          </w:p>
+        </w:tc>
+        <w:tc>
+          <w:tcPr>
+            <w:shd w:fill="FFFFFF" w:val="clear"/>
+            <w:tcMar>
+              <w:top w:type="dxa" w:w="60"/>
+              <w:left w:type="dxa" w:w="100"/>
+              <w:bottom w:type="dxa" w:w="60"/>
+              <w:right w:type="dxa" w:w="100"/>
+            </w:tcMar>
+          </w:tcPr>
+          <w:p>
+            <w:pPr>
+              <w:spacing w:after="60" w:before="60"/>
+            </w:pPr>
+            <w:r>
+              <w:rPr>
+                <w:rFonts w:ascii="Calibri" w:cs="Calibri" w:eastAsia="Calibri" w:hAnsi="Calibri"/>
+                <w:b w:val="false"/>
+                <w:bCs w:val="false"/>
+                <w:color w:val="000000"/>
+                <w:sz w:val="18"/>
+                <w:szCs w:val="18"/>
+              </w:rPr>
+              <w:t xml:space="preserve">Clic en "Asignar" → seleccionar cuidador disponible → confirmar</w:t>
+            </w:r>
+          </w:p>
+        </w:tc>
+        <w:tc>
+          <w:tcPr>
+            <w:shd w:fill="FFFFFF" w:val="clear"/>
+            <w:tcMar>
+              <w:top w:type="dxa" w:w="60"/>
+              <w:left w:type="dxa" w:w="100"/>
+              <w:bottom w:type="dxa" w:w="60"/>
+              <w:right w:type="dxa" w:w="100"/>
+            </w:tcMar>
+          </w:tcPr>
+          <w:p>
+            <w:pPr>
+              <w:spacing w:after="60" w:before="60"/>
+            </w:pPr>
+            <w:r>
+              <w:rPr>
+                <w:rFonts w:ascii="Calibri" w:cs="Calibri" w:eastAsia="Calibri" w:hAnsi="Calibri"/>
+                <w:b w:val="false"/>
+                <w:bCs w:val="false"/>
+                <w:color w:val="000000"/>
+                <w:sz w:val="18"/>
+                <w:szCs w:val="18"/>
+              </w:rPr>
+              <w:t xml:space="preserve">"La asigna al cuidador disponible en turno."</w:t>
+            </w:r>
+          </w:p>
+        </w:tc>
+        <w:tc>
+          <w:tcPr>
+            <w:shd w:fill="FFFFFF" w:val="clear"/>
+            <w:tcMar>
+              <w:top w:type="dxa" w:w="60"/>
+              <w:left w:type="dxa" w:w="100"/>
+              <w:bottom w:type="dxa" w:w="60"/>
+              <w:right w:type="dxa" w:w="100"/>
+            </w:tcMar>
+          </w:tcPr>
+          <w:p>
+            <w:pPr>
+              <w:spacing w:after="60" w:before="60"/>
+            </w:pPr>
+            <w:r>
+              <w:rPr>
+                <w:rFonts w:ascii="Calibri" w:cs="Calibri" w:eastAsia="Calibri" w:hAnsi="Calibri"/>
+                <w:b w:val="false"/>
+                <w:bCs w:val="false"/>
+                <w:color w:val="000000"/>
+                <w:sz w:val="18"/>
+                <w:szCs w:val="18"/>
+              </w:rPr>
+              <w:t xml:space="preserve">6 s</w:t>
+            </w:r>
+          </w:p>
+        </w:tc>
+      </w:tr>
+      <w:tr>
+        <w:tc>
+          <w:tcPr>
+            <w:shd w:fill="D6EAF8" w:val="clear"/>
+            <w:tcMar>
+              <w:top w:type="dxa" w:w="60"/>
+              <w:left w:type="dxa" w:w="100"/>
+              <w:bottom w:type="dxa" w:w="60"/>
+              <w:right w:type="dxa" w:w="100"/>
+            </w:tcMar>
+          </w:tcPr>
+          <w:p>
+            <w:pPr>
+              <w:spacing w:after="60" w:before="60"/>
+            </w:pPr>
+            <w:r>
+              <w:rPr>
+                <w:rFonts w:ascii="Calibri" w:cs="Calibri" w:eastAsia="Calibri" w:hAnsi="Calibri"/>
+                <w:b w:val="false"/>
+                <w:bCs w:val="false"/>
+                <w:color w:val="000000"/>
+                <w:sz w:val="18"/>
+                <w:szCs w:val="18"/>
+              </w:rPr>
+              <w:t xml:space="preserve">6</w:t>
+            </w:r>
+          </w:p>
+        </w:tc>
+        <w:tc>
+          <w:tcPr>
+            <w:shd w:fill="D6EAF8" w:val="clear"/>
+            <w:tcMar>
+              <w:top w:type="dxa" w:w="60"/>
+              <w:left w:type="dxa" w:w="100"/>
+              <w:bottom w:type="dxa" w:w="60"/>
+              <w:right w:type="dxa" w:w="100"/>
+            </w:tcMar>
+          </w:tcPr>
+          <w:p>
+            <w:pPr>
+              <w:spacing w:after="60" w:before="60"/>
+            </w:pPr>
+            <w:r>
+              <w:rPr>
+                <w:rFonts w:ascii="Calibri" w:cs="Calibri" w:eastAsia="Calibri" w:hAnsi="Calibri"/>
+                <w:b w:val="false"/>
+                <w:bCs w:val="false"/>
+                <w:color w:val="000000"/>
+                <w:sz w:val="18"/>
+                <w:szCs w:val="18"/>
+              </w:rPr>
+              <w:t xml:space="preserve">Pestaña Bitácora — fila de auditoría con actor + hora + acción para cada paso. Scroll rápido por 3 eventos.</w:t>
+            </w:r>
+          </w:p>
+        </w:tc>
+        <w:tc>
+          <w:tcPr>
+            <w:shd w:fill="D6EAF8" w:val="clear"/>
+            <w:tcMar>
+              <w:top w:type="dxa" w:w="60"/>
+              <w:left w:type="dxa" w:w="100"/>
+              <w:bottom w:type="dxa" w:w="60"/>
+              <w:right w:type="dxa" w:w="100"/>
+            </w:tcMar>
+          </w:tcPr>
+          <w:p>
+            <w:pPr>
+              <w:spacing w:after="60" w:before="60"/>
+            </w:pPr>
+            <w:r>
+              <w:rPr>
+                <w:rFonts w:ascii="Calibri" w:cs="Calibri" w:eastAsia="Calibri" w:hAnsi="Calibri"/>
+                <w:b w:val="false"/>
+                <w:bCs w:val="false"/>
+                <w:color w:val="000000"/>
+                <w:sz w:val="18"/>
+                <w:szCs w:val="18"/>
+              </w:rPr>
+              <w:t xml:space="preserve">"Y aquí está la bitácora inmutable: quién hizo qué, a qué hora exacta. Esto es lo que la NOM-031 exige y lo que protege al director ante cualquier inspección."</w:t>
+            </w:r>
+          </w:p>
+        </w:tc>
+        <w:tc>
+          <w:tcPr>
+            <w:shd w:fill="D6EAF8" w:val="clear"/>
+            <w:tcMar>
+              <w:top w:type="dxa" w:w="60"/>
+              <w:left w:type="dxa" w:w="100"/>
+              <w:bottom w:type="dxa" w:w="60"/>
+              <w:right w:type="dxa" w:w="100"/>
+            </w:tcMar>
+          </w:tcPr>
+          <w:p>
+            <w:pPr>
+              <w:spacing w:after="60" w:before="60"/>
+            </w:pPr>
+            <w:r>
+              <w:rPr>
+                <w:rFonts w:ascii="Calibri" w:cs="Calibri" w:eastAsia="Calibri" w:hAnsi="Calibri"/>
+                <w:b w:val="false"/>
+                <w:bCs w:val="false"/>
+                <w:color w:val="000000"/>
+                <w:sz w:val="18"/>
+                <w:szCs w:val="18"/>
+              </w:rPr>
+              <w:t xml:space="preserve">12 s</w:t>
+            </w:r>
+          </w:p>
+        </w:tc>
+      </w:tr>
+    </w:tbl>
+    <w:p/>
+    <w:p>
+      <w:pPr>
+        <w:spacing w:after="80"/>
+      </w:pPr>
+      <w:r>
+        <w:rPr>
+          <w:rFonts w:ascii="Calibri" w:cs="Calibri" w:eastAsia="Calibri" w:hAnsi="Calibri"/>
+          <w:i/>
+          <w:iCs/>
+          <w:color w:val="CA6F1E"/>
+          <w:sz w:val="20"/>
+          <w:szCs w:val="20"/>
+        </w:rPr>
+        <w:t xml:space="preserve">⏱ Si el proyector falla: describe la secuencia en voz alta — "el sistema haría X, luego Y". No te disculpes; sigue el ritmo.</w:t>
+      </w:r>
+    </w:p>
+    <w:p>
+      <w:pPr>
+        <w:spacing w:after="80"/>
+      </w:pPr>
+      <w:r>
+        <w:rPr>
+          <w:rFonts w:ascii="Calibri" w:cs="Calibri" w:eastAsia="Calibri" w:hAnsi="Calibri"/>
+          <w:i/>
+          <w:iCs/>
+          <w:color w:val="CA6F1E"/>
+          <w:sz w:val="20"/>
+          <w:szCs w:val="20"/>
+        </w:rPr>
+        <w:t xml:space="preserve">⏱ Si el reloj no avanza: usa el botón "Reset demo" para volver al estado inicial y repite desde paso 1.</w:t>
+      </w:r>
+    </w:p>
+    <w:p/>
+    <w:p>
+      <w:pPr>
+        <w:spacing w:after="80"/>
+      </w:pPr>
+      <w:r>
+        <w:rPr>
+          <w:rFonts w:ascii="Calibri" w:cs="Calibri" w:eastAsia="Calibri" w:hAnsi="Calibri"/>
+          <w:b/>
+          <w:bCs/>
+          <w:color w:val="1A5276"/>
+          <w:sz w:val="22"/>
+          <w:szCs w:val="22"/>
+        </w:rPr>
+        <w:t xml:space="preserve">Frase de cierre del demo → puente al bloque de Mercado:</w:t>
       </w:r>
     </w:p>
     <w:p>
@@ -2190,46 +3134,20 @@
           <w:sz w:val="24"/>
           <w:szCs w:val="24"/>
         </w:rPr>
-        <w:t xml:space="preserve">"Son más de 1,300 residencias privadas en México, creciendo al 18% anual.</w:t>
-      </w:r>
-      <w:r>
-        <w:br/>
-        <w:t xml:space="preserve"/>
-      </w:r>
-      <w:r>
-        <w:rPr>
-          <w:rFonts w:ascii="Calibri" w:cs="Calibri" w:eastAsia="Calibri" w:hAnsi="Calibri"/>
-          <w:color w:val="000000"/>
-          <w:sz w:val="24"/>
-          <w:szCs w:val="24"/>
-        </w:rPr>
-        <w:t xml:space="preserve">Y dos millones de familias mexicanas coordinan el cuidado de un adulto mayor — ese es nuestro segundo mercado.</w:t>
-      </w:r>
-      <w:r>
-        <w:br/>
-        <w:t xml:space="preserve"/>
-      </w:r>
-      <w:r>
-        <w:rPr>
-          <w:rFonts w:ascii="Calibri" w:cs="Calibri" w:eastAsia="Calibri" w:hAnsi="Calibri"/>
-          <w:color w:val="000000"/>
-          <w:sz w:val="24"/>
-          <w:szCs w:val="24"/>
-        </w:rPr>
-        <w:t xml:space="preserve">Nuestro objetivo en 3 años: 50 a 200 residencias.</w:t>
-      </w:r>
-      <w:r>
-        <w:br/>
-        <w:t xml:space="preserve"/>
-      </w:r>
-      <w:r>
-        <w:rPr>
-          <w:rFonts w:ascii="Calibri" w:cs="Calibri" w:eastAsia="Calibri" w:hAnsi="Calibri"/>
-          <w:color w:val="000000"/>
-          <w:sz w:val="24"/>
-          <w:szCs w:val="24"/>
-        </w:rPr>
-        <w:t xml:space="preserve">A precio Profesional, entre 199,000 y 798,000 pesos mensuales recurrentes."</w:t>
+        <w:t xml:space="preserve">"Eso que acaban de ver — de ronda vencida a bitácora cerrada — ocurre en menos de dos minutos.</w:t>
+      </w:r>
+      <w:r>
+        <w:br/>
+        <w:t xml:space="preserve"/>
+      </w:r>
+      <w:r>
+        <w:rPr>
+          <w:rFonts w:ascii="Calibri" w:cs="Calibri" w:eastAsia="Calibri" w:hAnsi="Calibri"/>
+          <w:color w:val="000000"/>
+          <w:sz w:val="24"/>
+          <w:szCs w:val="24"/>
+        </w:rPr>
+        <w:t xml:space="preserve">Y ese flujo existe hoy, en producción, para más de 1,300 residencias en México."</w:t>
       </w:r>
     </w:p>
     <w:p>
@@ -2254,7 +3172,7 @@
           <w:sz w:val="28"/>
           <w:szCs w:val="28"/>
         </w:rPr>
-        <w:t xml:space="preserve">Bloque 4 · Diferenciador</w:t>
+        <w:t xml:space="preserve">Bloque 3 · Mercado</w:t>
       </w:r>
     </w:p>
     <w:p>
@@ -2270,7 +3188,7 @@
           <w:sz w:val="20"/>
           <w:szCs w:val="20"/>
         </w:rPr>
-        <w:t xml:space="preserve">Objetivo: un golpe limpio — por qué nadie más lo hace.</w:t>
+        <w:t xml:space="preserve">Objetivo: SAM y potencial de ingresos en 25 segundos.</w:t>
       </w:r>
       <w:r>
         <w:rPr>
@@ -2279,7 +3197,7 @@
           <w:sz w:val="20"/>
           <w:szCs w:val="20"/>
         </w:rPr>
-        <w:t xml:space="preserve">   ·   20 s   ·   Acumulado: 2:50</w:t>
+        <w:t xml:space="preserve">   ·   25 s   ·   Acumulado: 2:35</w:t>
       </w:r>
     </w:p>
     <w:p>
@@ -2295,7 +3213,7 @@
           <w:sz w:val="20"/>
           <w:szCs w:val="20"/>
         </w:rPr>
-        <w:t xml:space="preserve">⏱ Nombra los competidores con confianza — los conoces mejor que el juez.</w:t>
+        <w:t xml:space="preserve">⏱ El tamaño global ya se dijo en el bloque 1 — aquí solo el mercado accionable.</w:t>
       </w:r>
     </w:p>
     <w:p>
@@ -2313,46 +3231,46 @@
           <w:sz w:val="24"/>
           <w:szCs w:val="24"/>
         </w:rPr>
-        <w:t xml:space="preserve">"Los competidores — Cronos Care, GERIGES — son sistemas de expediente.</w:t>
-      </w:r>
-      <w:r>
-        <w:br/>
-        <w:t xml:space="preserve"/>
-      </w:r>
-      <w:r>
-        <w:rPr>
-          <w:rFonts w:ascii="Calibri" w:cs="Calibri" w:eastAsia="Calibri" w:hAnsi="Calibri"/>
-          <w:color w:val="000000"/>
-          <w:sz w:val="24"/>
-          <w:szCs w:val="24"/>
-        </w:rPr>
-        <w:t xml:space="preserve">Ninguno detecta una ronda atrasada.</w:t>
-      </w:r>
-      <w:r>
-        <w:br/>
-        <w:t xml:space="preserve"/>
-      </w:r>
-      <w:r>
-        <w:rPr>
-          <w:rFonts w:ascii="Calibri" w:cs="Calibri" w:eastAsia="Calibri" w:hAnsi="Calibri"/>
-          <w:color w:val="000000"/>
-          <w:sz w:val="24"/>
-          <w:szCs w:val="24"/>
-        </w:rPr>
-        <w:t xml:space="preserve">Ninguno tiene precio publicado.</w:t>
-      </w:r>
-      <w:r>
-        <w:br/>
-        <w:t xml:space="preserve"/>
-      </w:r>
-      <w:r>
-        <w:rPr>
-          <w:rFonts w:ascii="Calibri" w:cs="Calibri" w:eastAsia="Calibri" w:hAnsi="Calibri"/>
-          <w:color w:val="000000"/>
-          <w:sz w:val="24"/>
-          <w:szCs w:val="24"/>
-        </w:rPr>
-        <w:t xml:space="preserve">CareSignal es la única plataforma diseñada para el ciclo operativo de la ronda."</w:t>
+        <w:t xml:space="preserve">"Son más de 1,300 residencias privadas en México, creciendo al 18% anual.</w:t>
+      </w:r>
+      <w:r>
+        <w:br/>
+        <w:t xml:space="preserve"/>
+      </w:r>
+      <w:r>
+        <w:rPr>
+          <w:rFonts w:ascii="Calibri" w:cs="Calibri" w:eastAsia="Calibri" w:hAnsi="Calibri"/>
+          <w:color w:val="000000"/>
+          <w:sz w:val="24"/>
+          <w:szCs w:val="24"/>
+        </w:rPr>
+        <w:t xml:space="preserve">Y dos millones de familias mexicanas coordinan el cuidado de un adulto mayor — ese es nuestro segundo mercado.</w:t>
+      </w:r>
+      <w:r>
+        <w:br/>
+        <w:t xml:space="preserve"/>
+      </w:r>
+      <w:r>
+        <w:rPr>
+          <w:rFonts w:ascii="Calibri" w:cs="Calibri" w:eastAsia="Calibri" w:hAnsi="Calibri"/>
+          <w:color w:val="000000"/>
+          <w:sz w:val="24"/>
+          <w:szCs w:val="24"/>
+        </w:rPr>
+        <w:t xml:space="preserve">Nuestro objetivo en 3 años: 50 a 200 residencias.</w:t>
+      </w:r>
+      <w:r>
+        <w:br/>
+        <w:t xml:space="preserve"/>
+      </w:r>
+      <w:r>
+        <w:rPr>
+          <w:rFonts w:ascii="Calibri" w:cs="Calibri" w:eastAsia="Calibri" w:hAnsi="Calibri"/>
+          <w:color w:val="000000"/>
+          <w:sz w:val="24"/>
+          <w:szCs w:val="24"/>
+        </w:rPr>
+        <w:t xml:space="preserve">A precio Profesional, entre 199,000 y 798,000 pesos mensuales recurrentes."</w:t>
       </w:r>
     </w:p>
     <w:p>
@@ -2377,7 +3295,7 @@
           <w:sz w:val="28"/>
           <w:szCs w:val="28"/>
         </w:rPr>
-        <w:t xml:space="preserve">Bloque 5 · Tracción + Modelo de negocio</w:t>
+        <w:t xml:space="preserve">Bloque 4 · Diferenciador</w:t>
       </w:r>
     </w:p>
     <w:p>
@@ -2393,7 +3311,7 @@
           <w:sz w:val="20"/>
           <w:szCs w:val="20"/>
         </w:rPr>
-        <w:t xml:space="preserve">Objetivo: producto terminado y precio en un solo bloque.</w:t>
+        <w:t xml:space="preserve">Objetivo: un golpe limpio — por qué nadie más lo hace.</w:t>
       </w:r>
       <w:r>
         <w:rPr>
@@ -2402,7 +3320,7 @@
           <w:sz w:val="20"/>
           <w:szCs w:val="20"/>
         </w:rPr>
-        <w:t xml:space="preserve">   ·   25 s   ·   Acumulado: 3:15</w:t>
+        <w:t xml:space="preserve">   ·   20 s   ·   Acumulado: 2:55</w:t>
       </w:r>
     </w:p>
     <w:p>
@@ -2418,7 +3336,7 @@
           <w:sz w:val="20"/>
           <w:szCs w:val="20"/>
         </w:rPr>
-        <w:t xml:space="preserve">⏱ Ritmo rápido y seguro — cada número refuerza la credibilidad.</w:t>
+        <w:t xml:space="preserve">⏱ Nombra los competidores con confianza — los conoces mejor que el juez.</w:t>
       </w:r>
     </w:p>
     <w:p>
@@ -2436,46 +3354,46 @@
           <w:sz w:val="24"/>
           <w:szCs w:val="24"/>
         </w:rPr>
-        <w:t xml:space="preserve">"El MVP está terminado hoy.</w:t>
-      </w:r>
-      <w:r>
-        <w:br/>
-        <w:t xml:space="preserve"/>
-      </w:r>
-      <w:r>
-        <w:rPr>
-          <w:rFonts w:ascii="Calibri" w:cs="Calibri" w:eastAsia="Calibri" w:hAnsi="Calibri"/>
-          <w:color w:val="000000"/>
-          <w:sz w:val="24"/>
-          <w:szCs w:val="24"/>
-        </w:rPr>
-        <w:t xml:space="preserve">38 pruebas automatizadas. 20 de aceptación del contrato. Cero bloqueantes. Auditoría PASS.</w:t>
-      </w:r>
-      <w:r>
-        <w:br/>
-        <w:t xml:space="preserve"/>
-      </w:r>
-      <w:r>
-        <w:rPr>
-          <w:rFonts w:ascii="Calibri" w:cs="Calibri" w:eastAsia="Calibri" w:hAnsi="Calibri"/>
-          <w:color w:val="000000"/>
-          <w:sz w:val="24"/>
-          <w:szCs w:val="24"/>
-        </w:rPr>
-        <w:t xml:space="preserve">Freemium gratuito para capturar el mercado, más tres planes pagos desde 1,990 hasta 8,490 pesos al mes.</w:t>
-      </w:r>
-      <w:r>
-        <w:br/>
-        <w:t xml:space="preserve"/>
-      </w:r>
-      <w:r>
-        <w:rPr>
-          <w:rFonts w:ascii="Calibri" w:cs="Calibri" w:eastAsia="Calibri" w:hAnsi="Calibri"/>
-          <w:color w:val="000000"/>
-          <w:sz w:val="24"/>
-          <w:szCs w:val="24"/>
-        </w:rPr>
-        <w:t xml:space="preserve">Margen bruto superior al 80%."</w:t>
+        <w:t xml:space="preserve">"Los competidores — Cronos Care, GERIGES — son sistemas de expediente.</w:t>
+      </w:r>
+      <w:r>
+        <w:br/>
+        <w:t xml:space="preserve"/>
+      </w:r>
+      <w:r>
+        <w:rPr>
+          <w:rFonts w:ascii="Calibri" w:cs="Calibri" w:eastAsia="Calibri" w:hAnsi="Calibri"/>
+          <w:color w:val="000000"/>
+          <w:sz w:val="24"/>
+          <w:szCs w:val="24"/>
+        </w:rPr>
+        <w:t xml:space="preserve">Ninguno detecta una ronda atrasada.</w:t>
+      </w:r>
+      <w:r>
+        <w:br/>
+        <w:t xml:space="preserve"/>
+      </w:r>
+      <w:r>
+        <w:rPr>
+          <w:rFonts w:ascii="Calibri" w:cs="Calibri" w:eastAsia="Calibri" w:hAnsi="Calibri"/>
+          <w:color w:val="000000"/>
+          <w:sz w:val="24"/>
+          <w:szCs w:val="24"/>
+        </w:rPr>
+        <w:t xml:space="preserve">Ninguno tiene precio publicado.</w:t>
+      </w:r>
+      <w:r>
+        <w:br/>
+        <w:t xml:space="preserve"/>
+      </w:r>
+      <w:r>
+        <w:rPr>
+          <w:rFonts w:ascii="Calibri" w:cs="Calibri" w:eastAsia="Calibri" w:hAnsi="Calibri"/>
+          <w:color w:val="000000"/>
+          <w:sz w:val="24"/>
+          <w:szCs w:val="24"/>
+        </w:rPr>
+        <w:t xml:space="preserve">CareSignal es la única plataforma diseñada para el ciclo operativo de la ronda."</w:t>
       </w:r>
     </w:p>
     <w:p>
@@ -2500,7 +3418,7 @@
           <w:sz w:val="28"/>
           <w:szCs w:val="28"/>
         </w:rPr>
-        <w:t xml:space="preserve">Bloque 6 · IA y Ciberseguridad</w:t>
+        <w:t xml:space="preserve">Bloque 5 · Tracción + Modelo de negocio</w:t>
       </w:r>
     </w:p>
     <w:p>
@@ -2516,7 +3434,7 @@
           <w:sz w:val="20"/>
           <w:szCs w:val="20"/>
         </w:rPr>
-        <w:t xml:space="preserve">Objetivo: alinear con el eje del concurso en 20 segundos.</w:t>
+        <w:t xml:space="preserve">Objetivo: producto terminado y precio en un solo bloque.</w:t>
       </w:r>
       <w:r>
         <w:rPr>
@@ -2525,7 +3443,7 @@
           <w:sz w:val="20"/>
           <w:szCs w:val="20"/>
         </w:rPr>
-        <w:t xml:space="preserve">   ·   20 s   ·   Acumulado: 3:35</w:t>
+        <w:t xml:space="preserve">   ·   25 s   ·   Acumulado: 3:20</w:t>
       </w:r>
     </w:p>
     <w:p>
@@ -2541,7 +3459,7 @@
           <w:sz w:val="20"/>
           <w:szCs w:val="20"/>
         </w:rPr>
-        <w:t xml:space="preserve">⏱ Conecta directamente con los criterios 1 y 11 del concurso.</w:t>
+        <w:t xml:space="preserve">⏱ Ritmo rápido y seguro — cada número refuerza la credibilidad.</w:t>
       </w:r>
     </w:p>
     <w:p>
@@ -2559,46 +3477,46 @@
           <w:sz w:val="24"/>
           <w:szCs w:val="24"/>
         </w:rPr>
-        <w:t xml:space="preserve">"Los datos de adultos mayores son datos sensibles por ley — la LFPDPPP.</w:t>
-      </w:r>
-      <w:r>
-        <w:br/>
-        <w:t xml:space="preserve"/>
-      </w:r>
-      <w:r>
-        <w:rPr>
-          <w:rFonts w:ascii="Calibri" w:cs="Calibri" w:eastAsia="Calibri" w:hAnsi="Calibri"/>
-          <w:color w:val="000000"/>
-          <w:sz w:val="24"/>
-          <w:szCs w:val="24"/>
-        </w:rPr>
-        <w:t xml:space="preserve">CareSignal los estructura sobre Google Cloud Run y Firebase con cifrado extremo a extremo.</w:t>
-      </w:r>
-      <w:r>
-        <w:br/>
-        <w:t xml:space="preserve"/>
-      </w:r>
-      <w:r>
-        <w:rPr>
-          <w:rFonts w:ascii="Calibri" w:cs="Calibri" w:eastAsia="Calibri" w:hAnsi="Calibri"/>
-          <w:color w:val="000000"/>
-          <w:sz w:val="24"/>
-          <w:szCs w:val="24"/>
-        </w:rPr>
-        <w:t xml:space="preserve">La bitácora de 20 tipos de evento por turno es el insumo para alertas predictivas</w:t>
-      </w:r>
-      <w:r>
-        <w:br/>
-        <w:t xml:space="preserve"/>
-      </w:r>
-      <w:r>
-        <w:rPr>
-          <w:rFonts w:ascii="Calibri" w:cs="Calibri" w:eastAsia="Calibri" w:hAnsi="Calibri"/>
-          <w:color w:val="000000"/>
-          <w:sz w:val="24"/>
-          <w:szCs w:val="24"/>
-        </w:rPr>
-        <w:t xml:space="preserve">y un agente de ciberseguridad activo 24 horas sobre Gemini API de Google."</w:t>
+        <w:t xml:space="preserve">"El MVP está terminado hoy.</w:t>
+      </w:r>
+      <w:r>
+        <w:br/>
+        <w:t xml:space="preserve"/>
+      </w:r>
+      <w:r>
+        <w:rPr>
+          <w:rFonts w:ascii="Calibri" w:cs="Calibri" w:eastAsia="Calibri" w:hAnsi="Calibri"/>
+          <w:color w:val="000000"/>
+          <w:sz w:val="24"/>
+          <w:szCs w:val="24"/>
+        </w:rPr>
+        <w:t xml:space="preserve">38 pruebas automatizadas. 20 de aceptación del contrato. Cero bloqueantes. Auditoría PASS.</w:t>
+      </w:r>
+      <w:r>
+        <w:br/>
+        <w:t xml:space="preserve"/>
+      </w:r>
+      <w:r>
+        <w:rPr>
+          <w:rFonts w:ascii="Calibri" w:cs="Calibri" w:eastAsia="Calibri" w:hAnsi="Calibri"/>
+          <w:color w:val="000000"/>
+          <w:sz w:val="24"/>
+          <w:szCs w:val="24"/>
+        </w:rPr>
+        <w:t xml:space="preserve">Freemium gratuito para capturar el mercado, más tres planes pagos desde 1,990 hasta 8,490 pesos al mes.</w:t>
+      </w:r>
+      <w:r>
+        <w:br/>
+        <w:t xml:space="preserve"/>
+      </w:r>
+      <w:r>
+        <w:rPr>
+          <w:rFonts w:ascii="Calibri" w:cs="Calibri" w:eastAsia="Calibri" w:hAnsi="Calibri"/>
+          <w:color w:val="000000"/>
+          <w:sz w:val="24"/>
+          <w:szCs w:val="24"/>
+        </w:rPr>
+        <w:t xml:space="preserve">Margen bruto superior al 80%."</w:t>
       </w:r>
     </w:p>
     <w:p>
@@ -2623,7 +3541,7 @@
           <w:sz w:val="28"/>
           <w:szCs w:val="28"/>
         </w:rPr>
-        <w:t xml:space="preserve">Bloque 7 · Cierre</w:t>
+        <w:t xml:space="preserve">Bloque 6 · IA y Ciberseguridad</w:t>
       </w:r>
     </w:p>
     <w:p>
@@ -2639,7 +3557,7 @@
           <w:sz w:val="20"/>
           <w:szCs w:val="20"/>
         </w:rPr>
-        <w:t xml:space="preserve">Objetivo: oportunidad + llamada a la acción. Mirando al juez.</w:t>
+        <w:t xml:space="preserve">Objetivo: alinear con el eje del concurso en 20 segundos.</w:t>
       </w:r>
       <w:r>
         <w:rPr>
@@ -2648,7 +3566,130 @@
           <w:sz w:val="20"/>
           <w:szCs w:val="20"/>
         </w:rPr>
-        <w:t xml:space="preserve">   ·   25 s   ·   Acumulado: 4:00</w:t>
+        <w:t xml:space="preserve">   ·   20 s   ·   Acumulado: 3:40</w:t>
+      </w:r>
+    </w:p>
+    <w:p>
+      <w:pPr>
+        <w:spacing w:after="80"/>
+      </w:pPr>
+      <w:r>
+        <w:rPr>
+          <w:rFonts w:ascii="Calibri" w:cs="Calibri" w:eastAsia="Calibri" w:hAnsi="Calibri"/>
+          <w:i/>
+          <w:iCs/>
+          <w:color w:val="CA6F1E"/>
+          <w:sz w:val="20"/>
+          <w:szCs w:val="20"/>
+        </w:rPr>
+        <w:t xml:space="preserve">⏱ Conecta directamente con los criterios 1 y 11 del concurso.</w:t>
+      </w:r>
+    </w:p>
+    <w:p>
+      <w:pPr>
+        <w:pBdr>
+          <w:left w:val="single" w:color="1A5276" w:sz="12"/>
+        </w:pBdr>
+        <w:spacing w:after="200" w:before="120" w:line="320"/>
+        <w:ind w:left="680"/>
+      </w:pPr>
+      <w:r>
+        <w:rPr>
+          <w:rFonts w:ascii="Calibri" w:cs="Calibri" w:eastAsia="Calibri" w:hAnsi="Calibri"/>
+          <w:color w:val="000000"/>
+          <w:sz w:val="24"/>
+          <w:szCs w:val="24"/>
+        </w:rPr>
+        <w:t xml:space="preserve">"Los datos de adultos mayores son datos sensibles por ley — la LFPDPPP.</w:t>
+      </w:r>
+      <w:r>
+        <w:br/>
+        <w:t xml:space="preserve"/>
+      </w:r>
+      <w:r>
+        <w:rPr>
+          <w:rFonts w:ascii="Calibri" w:cs="Calibri" w:eastAsia="Calibri" w:hAnsi="Calibri"/>
+          <w:color w:val="000000"/>
+          <w:sz w:val="24"/>
+          <w:szCs w:val="24"/>
+        </w:rPr>
+        <w:t xml:space="preserve">CareSignal los estructura sobre Google Cloud Run y Firebase con cifrado extremo a extremo.</w:t>
+      </w:r>
+      <w:r>
+        <w:br/>
+        <w:t xml:space="preserve"/>
+      </w:r>
+      <w:r>
+        <w:rPr>
+          <w:rFonts w:ascii="Calibri" w:cs="Calibri" w:eastAsia="Calibri" w:hAnsi="Calibri"/>
+          <w:color w:val="000000"/>
+          <w:sz w:val="24"/>
+          <w:szCs w:val="24"/>
+        </w:rPr>
+        <w:t xml:space="preserve">La bitácora de 20 tipos de evento por turno es el insumo para alertas predictivas</w:t>
+      </w:r>
+      <w:r>
+        <w:br/>
+        <w:t xml:space="preserve"/>
+      </w:r>
+      <w:r>
+        <w:rPr>
+          <w:rFonts w:ascii="Calibri" w:cs="Calibri" w:eastAsia="Calibri" w:hAnsi="Calibri"/>
+          <w:color w:val="000000"/>
+          <w:sz w:val="24"/>
+          <w:szCs w:val="24"/>
+        </w:rPr>
+        <w:t xml:space="preserve">y un agente de ciberseguridad activo 24 horas sobre Gemini API de Google."</w:t>
+      </w:r>
+    </w:p>
+    <w:p>
+      <w:pPr>
+        <w:pBdr>
+          <w:bottom w:val="single" w:color="D6EAF8" w:sz="4"/>
+        </w:pBdr>
+        <w:spacing w:after="200"/>
+      </w:pPr>
+    </w:p>
+    <w:p>
+      <w:pPr>
+        <w:shd w:fill="1A5276" w:val="clear"/>
+        <w:spacing w:after="160" w:before="280"/>
+      </w:pPr>
+      <w:r>
+        <w:rPr>
+          <w:rFonts w:ascii="Calibri" w:cs="Calibri" w:eastAsia="Calibri" w:hAnsi="Calibri"/>
+          <w:b/>
+          <w:bCs/>
+          <w:color w:val="FFFFFF"/>
+          <w:sz w:val="28"/>
+          <w:szCs w:val="28"/>
+        </w:rPr>
+        <w:t xml:space="preserve">Bloque 7 · Cierre</w:t>
+      </w:r>
+    </w:p>
+    <w:p>
+      <w:pPr>
+        <w:spacing w:after="120" w:before="80"/>
+      </w:pPr>
+      <w:r>
+        <w:rPr>
+          <w:rFonts w:ascii="Calibri" w:cs="Calibri" w:eastAsia="Calibri" w:hAnsi="Calibri"/>
+          <w:b/>
+          <w:bCs/>
+          <w:color w:val="1A5276"/>
+          <w:sz w:val="20"/>
+          <w:szCs w:val="20"/>
+        </w:rPr>
+        <w:t xml:space="preserve">Objetivo: oportunidad + llamada a la acción. Mirando al juez.</w:t>
+      </w:r>
+      <w:r>
+        <w:rPr>
+          <w:rFonts w:ascii="Calibri" w:cs="Calibri" w:eastAsia="Calibri" w:hAnsi="Calibri"/>
+          <w:color w:val="424242"/>
+          <w:sz w:val="20"/>
+          <w:szCs w:val="20"/>
+        </w:rPr>
+        <w:t xml:space="preserve">   ·   20 s   ·   Acumulado: 4:00</w:t>
       </w:r>
     </w:p>
     <w:p>

</xml_diff>